<commit_message>
docs(lecture-1029): update master lecture notes and docx with tonight's complete in-class quiz questions, rationales, and error taxonomy tables
</commit_message>
<xml_diff>
--- a/KCEMS_Lecture_Notes_10-29-26_Ch02_Safety_Ch09_Teamwork.docx
+++ b/KCEMS_Lecture_Notes_10-29-26_Ch02_Safety_Ch09_Teamwork.docx
@@ -4,7 +4,7 @@
   <w:body>
     <w:p>
       <w:pPr>
-        <w:spacing w:after="40"/>
+        <w:spacing w:before="0" w:after="40"/>
         <w:jc w:val="center"/>
       </w:pPr>
       <w:r>
@@ -22,9 +22,9 @@
           <w:rFonts w:ascii="Calibri" w:hAnsi="Calibri"/>
           <w:b/>
           <w:color w:val="102C57"/>
-          <w:sz w:val="42"/>
+          <w:sz w:val="40"/>
         </w:rPr>
-        <w:t>BLOCK #3 MASTER LECTURE NOTES &amp; STUDY GUIDE</w:t>
+        <w:t>BLOCK #3 MASTER LECTURE NOTES &amp; IN-CLASS QUIZ COMPENDIUM</w:t>
         <w:br/>
       </w:r>
       <w:r>
@@ -43,8 +43,7 @@
           <w:i/>
           <w:sz w:val="20"/>
         </w:rPr>
-        <w:t>Lecture Date: Thursday, October 29, 2026 (18:00 – 22:00 hrs) | Block #3 Practical Skills Lab</w:t>
-        <w:br/>
+        <w:t>Lecture Date: Thursday, October 29, 2026 (18:00 – 22:00 hrs) | Tonight's Quiz Analysis Included</w:t>
       </w:r>
     </w:p>
     <w:p>
@@ -85,7 +84,7 @@
                 <w:color w:val="102C57"/>
                 <w:sz w:val="22"/>
               </w:rPr>
-              <w:t>SESSION BRIEFING &amp; CORE OBJECTIVES</w:t>
+              <w:t>EXECUTIVE BRIEFING &amp; SESSION BLUEPRINT</w:t>
             </w:r>
           </w:p>
           <w:p>
@@ -93,13 +92,13 @@
               <w:spacing w:after="40"/>
             </w:pPr>
             <w:r>
-              <w:t>• Academic Reading: AAOS 12th Ed., Chapter 2 (pp. 30–83) &amp; Chapter 9 (pp. 319–335).</w:t>
+              <w:t>• Core Curriculum: AAOS 12th Ed., Chapter 2 (pp. 30–83) &amp; Chapter 9 (pp. 319–335).</w:t>
               <w:br/>
-              <w:t>• Core Theme: Safety of the workforce is paramount—an injured or incapacitated provider cannot render aid. Team synergy, closed-loop communication, and crew resource management (CRM) directly reduce preventable prehospital mortality.</w:t>
+              <w:t>• Primary Directives: Provider safety is non-negotiable—scene safety, infection control, and psychological resilience form the foundation of field practice. Patient outcomes in complex emergencies depend on Crew Resource Management (CRM), standardized SBAR handovers, closed-loop communications, and flawless BLS/ALS coordination.</w:t>
               <w:br/>
-              <w:t>• Practical Lab Focus: Block #3 Skills Retests &amp; Core Skill Mastery (#21 Trauma, #25 CPR/AED, #57/#65 ASA &amp; NTG, #61/#73 Oral Glucose &amp; BGM).</w:t>
+              <w:t>• In-Class Evaluation: Features complete question breakdowns and clinical rationales for tonight's in-class quiz items.</w:t>
               <w:br/>
-              <w:t>• Key Testing Threshold: National EMS Standards &amp; King County BLS Protocols require 80% passing on all written evaluations.</w:t>
+              <w:t>• Skills Lab Focus: Block #3 skills mastery for Saturday retests and next week's practical exam.</w:t>
             </w:r>
           </w:p>
         </w:tc>
@@ -125,7 +124,7 @@
         <w:spacing w:before="160" w:after="40"/>
       </w:pPr>
       <w:r>
-        <w:t>1.1 Personal Wellness, Physical Fitness &amp; Sleep Hygiene</w:t>
+        <w:t>1.1 Personal Health, Physical Fitness &amp; Sleep Hygiene</w:t>
       </w:r>
     </w:p>
     <w:p>
@@ -134,7 +133,7 @@
         <w:ind w:left="288"/>
       </w:pPr>
       <w:r>
-        <w:t>• Foundational Concept: Wellness is a state of complete physical, mental, and social well-being, not merely the absence of disease. EMS is physically demanding and mentally strenuous.</w:t>
+        <w:t>• Foundational Principle: A provider who is injured, ill, exhausted, or impaired cannot deliver safe patient care. Personal wellness is the prerequisite for all emergency operations.</w:t>
       </w:r>
     </w:p>
     <w:p>
@@ -143,7 +142,7 @@
         <w:ind w:left="288"/>
       </w:pPr>
       <w:r>
-        <w:t>• Nutrition &amp; Hydration: Complex carbohydrates and lean proteins provide sustained energy. Avoid high-sugar snacks and excessive caffeine, which cause energy crashes. Hydrate primarily with water; drink fluids continuously, not just when thirsty.</w:t>
+        <w:t>• Nutrition &amp; Hydration: Consume complex carbohydrates and lean proteins for stable, long-lasting energy. Avoid excessive caffeine and high-sugar energy drinks that lead to acute spikes followed by severe fatigue crashes. Maintain constant hydration with water throughout your shift.</w:t>
       </w:r>
     </w:p>
     <w:p>
@@ -152,7 +151,7 @@
         <w:ind w:left="288"/>
       </w:pPr>
       <w:r>
-        <w:t>• Sleep Hygiene &amp; Circadian Rhythms: Disruption of the body's internal 24-hour circadian clock leads to chronic fatigue, impaired judgment, delayed reaction time, and increased vehicle collisions. Ensure 7–9 hours of sleep; during night shifts, use blackout curtains, white noise machines, and avoid screens (blue light) before bedtime.</w:t>
+        <w:t>• Circadian Rhythms &amp; Sleep Deprivation: The body operates on a natural 24-hour biological cycle. Sleep deficit causes slowed cognitive processing, delayed reflexes, mood disturbances, and significantly increases the incidence of emergency vehicle crashes. Ensure 7–9 hours of sleep; during night-shift assignments, sleep in darkened, cool rooms with blackout curtains, eliminate blue-light screens before bed, and maintain a consistent schedule.</w:t>
       </w:r>
     </w:p>
     <w:p>
@@ -161,7 +160,7 @@
         <w:ind w:left="288"/>
       </w:pPr>
       <w:r>
-        <w:t>• Lifting &amp; Moving Ergonomics: Keep your back straight, upright, and locked; lift primarily with your legs (quadriceps and gluteals), never your back. Keep the patient's weight as close to your body as possible. Avoid twisting while carrying loads.</w:t>
+        <w:t>• Lifting &amp; Moving Ergonomics: Keep your back locked upright in a neutral spinal posture; lift primarily using your quadriceps and gluteals (leg drive), never by bending your lumbar spine. Keep the patient's weight as close to your body as possible. Avoid twisting, jerking, or hyperextending during patient moves.</w:t>
       </w:r>
     </w:p>
     <w:p>
@@ -170,7 +169,7 @@
         <w:spacing w:before="160" w:after="40"/>
       </w:pPr>
       <w:r>
-        <w:t>1.2 Infectious Diseases, Pathogen Types &amp; Transmission Routes</w:t>
+        <w:t>1.2 Infectious Diseases, Pathogen Classifications &amp; Transmission Routes</w:t>
       </w:r>
     </w:p>
     <w:p>
@@ -179,7 +178,7 @@
         <w:ind w:left="288"/>
       </w:pPr>
       <w:r>
-        <w:t>• Infectious vs. Communicable Disease: An infectious disease is caused by the growth and spread of small, harmful organisms within the body. A communicable disease is an infectious disease that can be transmitted from one person or species to another.</w:t>
+        <w:t>• Infectious vs. Communicable: An infectious disease is caused by the proliferation of harmful microscopic organisms within the host. A communicable disease is an infectious disease that can spread directly or indirectly from one person to another.</w:t>
       </w:r>
     </w:p>
     <w:p>
@@ -188,43 +187,43 @@
         <w:ind w:left="288"/>
       </w:pPr>
       <w:r>
-        <w:t>• Pathogen Classifications:</w:t>
+        <w:t>• Pathogen Categories:</w:t>
       </w:r>
     </w:p>
     <w:p>
       <w:pPr>
         <w:spacing w:before="20" w:after="20"/>
-        <w:ind w:left="576"/>
+        <w:ind w:left="288"/>
       </w:pPr>
       <w:r>
-        <w:t xml:space="preserve">   - Bacteria: Single-celled organisms that can reproduce independently and cause diseases like tuberculosis, strep throat, and salmonella (treated with antibiotics).</w:t>
+        <w:t>•    • Bacteria: Independent, single-celled organisms capable of self-replication; cause conditions like tuberculosis, bacterial pneumonia, staph/strep infections; treatable with targeted antibiotics.</w:t>
       </w:r>
     </w:p>
     <w:p>
       <w:pPr>
         <w:spacing w:before="20" w:after="20"/>
-        <w:ind w:left="576"/>
+        <w:ind w:left="288"/>
       </w:pPr>
       <w:r>
-        <w:t xml:space="preserve">   - Viruses: Submicroscopic agents that require a living host cell to replicate; cause illnesses such as Hepatitis B/C, HIV, Influenza, and COVID-19.</w:t>
+        <w:t>•    • Viruses: Submicroscopic pathogens that require living host cells to reproduce; cause illnesses like Hepatitis B, Hepatitis C, HIV, Influenza, and COVID-19; not affected by antibiotics.</w:t>
       </w:r>
     </w:p>
     <w:p>
       <w:pPr>
         <w:spacing w:before="20" w:after="20"/>
-        <w:ind w:left="576"/>
+        <w:ind w:left="288"/>
       </w:pPr>
       <w:r>
-        <w:t xml:space="preserve">   - Fungi: Plant-like microorganisms (e.g., Candida, histoplasmosis).</w:t>
+        <w:t>•    • Fungi: Plant-like microorganisms (e.g., Candida, athlete's foot, molds).</w:t>
       </w:r>
     </w:p>
     <w:p>
       <w:pPr>
         <w:spacing w:before="20" w:after="20"/>
-        <w:ind w:left="576"/>
+        <w:ind w:left="288"/>
       </w:pPr>
       <w:r>
-        <w:t xml:space="preserve">   - Parasites / Helminths: Protozoans (malaria) and worms (pinworms, tapeworms).</w:t>
+        <w:t>•    • Parasites / Helminths: Protozoans (e.g., malaria) and intestinal worms (pinworms, tapeworms).</w:t>
       </w:r>
     </w:p>
     <w:p>
@@ -233,61 +232,61 @@
         <w:ind w:left="288"/>
       </w:pPr>
       <w:r>
-        <w:t>• Transmission Routes:</w:t>
+        <w:t>• Modes of Disease Transmission:</w:t>
       </w:r>
     </w:p>
     <w:p>
       <w:pPr>
         <w:spacing w:before="20" w:after="20"/>
-        <w:ind w:left="576"/>
+        <w:ind w:left="288"/>
       </w:pPr>
       <w:r>
-        <w:t xml:space="preserve">   - Direct Contact: Physical contact between an infected individual and an EMT (e.g., blood splash into eyes or open cuts, needle sticks).</w:t>
+        <w:t>•    • Direct Contact: Physical transfer of blood or infectious secretions into non-intact skin or mucous membranes (e.g., needle sticks, blood splatters into eyes).</w:t>
       </w:r>
     </w:p>
     <w:p>
       <w:pPr>
         <w:spacing w:before="20" w:after="20"/>
-        <w:ind w:left="576"/>
+        <w:ind w:left="288"/>
       </w:pPr>
       <w:r>
-        <w:t xml:space="preserve">   - Indirect Contact (Fomites): Spread of infection through an inanimate object (e.g., contaminated stethoscope, stretcher, blood pressure cuff, radio).</w:t>
+        <w:t>•    • Indirect Contact (Fomites): Transmission via an inanimate object that has been contaminated (e.g., stethoscope, stretcher mattress, blood pressure cuff, radio).</w:t>
       </w:r>
     </w:p>
     <w:p>
       <w:pPr>
         <w:spacing w:before="20" w:after="20"/>
-        <w:ind w:left="576"/>
+        <w:ind w:left="288"/>
       </w:pPr>
       <w:r>
-        <w:t xml:space="preserve">   - Droplet Transmission: Pathogens propelled through the air in respiratory droplets during coughing or sneezing, traveling short distances (&lt; 6 feet) before settling.</w:t>
+        <w:t>•    • Droplet Transmission: Pathogens expelled in large respiratory droplets during coughing, sneezing, or speaking that travel short distances (&lt; 6 feet) before settling.</w:t>
       </w:r>
     </w:p>
     <w:p>
       <w:pPr>
         <w:spacing w:before="20" w:after="20"/>
-        <w:ind w:left="576"/>
+        <w:ind w:left="288"/>
       </w:pPr>
       <w:r>
-        <w:t xml:space="preserve">   - Airborne / Aerosol Transmission: Microscopic droplet nuclei that remain suspended in the air for prolonged periods and can be inhaled deep into the alveoli (e.g., Mycobacterium tuberculosis, measles, varicella/chickenpox).</w:t>
+        <w:t>•    • Airborne / Aerosol Transmission: Microscopic droplet nuclei that remain suspended in ambient air currents for hours and can be inhaled deep into the lung alveoli (e.g., Mycobacterium tuberculosis, measles, varicella/chickenpox).</w:t>
       </w:r>
     </w:p>
     <w:p>
       <w:pPr>
         <w:spacing w:before="20" w:after="20"/>
-        <w:ind w:left="576"/>
+        <w:ind w:left="288"/>
       </w:pPr>
       <w:r>
-        <w:t xml:space="preserve">   - Foodborne / Waterborne: Ingestion of contaminated food or water (e.g., hepatitis A, norovirus).</w:t>
+        <w:t>•    • Foodborne / Waterborne: Ingestion of contaminated food or potable water (e.g., hepatitis A, salmonella, norovirus).</w:t>
       </w:r>
     </w:p>
     <w:p>
       <w:pPr>
         <w:spacing w:before="20" w:after="20"/>
-        <w:ind w:left="576"/>
+        <w:ind w:left="288"/>
       </w:pPr>
       <w:r>
-        <w:t xml:space="preserve">   - Vector-Borne: Transmission via an insect or animal bite (e.g., Lyme disease via deer ticks, West Nile virus via mosquitoes).</w:t>
+        <w:t>•    • Vector-Borne: Inoculation via an animal or insect bite (e.g., Lyme disease via deer ticks, West Nile virus via mosquitoes).</w:t>
       </w:r>
     </w:p>
     <w:p>
@@ -296,7 +295,7 @@
         <w:spacing w:before="160" w:after="40"/>
       </w:pPr>
       <w:r>
-        <w:t>1.3 Standard Precautions, OSHA Regulations &amp; The Ryan White Act</w:t>
+        <w:t>1.3 Standard Precautions, OSHA 1910.1030 &amp; The Ryan White Act</w:t>
       </w:r>
     </w:p>
     <w:p>
@@ -305,7 +304,7 @@
         <w:ind w:left="288"/>
       </w:pPr>
       <w:r>
-        <w:t>• Standard Precautions: CDC and OSHA guidelines designed to prevent healthcare workers from exposure to blood, body fluids, non-intact skin, and mucous membranes. Treat all human blood and bodily fluids as if known to be infectious for HIV, HBV, and other bloodborne pathogens.</w:t>
+        <w:t>• Standard Precautions: CDC and OSHA infection-control guidelines mandating that all human blood, body fluids, secretions, non-intact skin, and mucous membranes be treated as infectious for bloodborne pathogens (HIV, HBV, HCV).</w:t>
       </w:r>
     </w:p>
     <w:p>
@@ -314,7 +313,7 @@
         <w:ind w:left="288"/>
       </w:pPr>
       <w:r>
-        <w:t>• OSHA Bloodborne Pathogens Standard (29 CFR 1910.1030): Mandates that emergency service agencies have a written Exposure Control Plan, provide free Hepatitis B vaccinations, supply PPE, offer post-exposure evaluations, and conduct annual training.</w:t>
+        <w:t>• OSHA Bloodborne Pathogens Standard (29 CFR 1910.1030): Legally requires EMS employers to establish a written Exposure Control Plan, provide free Hepatitis B vaccinations, furnish accessible PPE, conduct annual training, maintain exposure logs, and offer immediate post-exposure medical evaluations.</w:t>
       </w:r>
     </w:p>
     <w:p>
@@ -323,7 +322,25 @@
         <w:ind w:left="288"/>
       </w:pPr>
       <w:r>
-        <w:t>• Ryan White Comprehensive AIDS Resources Emergency Act: Federal legislation establishing an exposure notification procedure for emergency responders. Designates an agency Designated Infection Control Officer (DICO). For airborne diseases (e.g., TB), the medical facility must notify the DICO within 48 hours if a patient tests positive. For bloodborne exposures (e.g., needle sticks), the EMT initiates the inquiry through the DICO.</w:t>
+        <w:t>• The Ryan White Comprehensive AIDS Resources Emergency Act: Federal statute establishing clear exposure notification channels for emergency medical personnel through the agency's Designated Infection Control Officer (DICO):</w:t>
+      </w:r>
+    </w:p>
+    <w:p>
+      <w:pPr>
+        <w:spacing w:before="20" w:after="20"/>
+        <w:ind w:left="288"/>
+      </w:pPr>
+      <w:r>
+        <w:t>•    • Airborne Exposures (e.g., TB): The receiving medical facility is legally required to notify the agency DICO within 48 hours of confirming a positive diagnosis.</w:t>
+      </w:r>
+    </w:p>
+    <w:p>
+      <w:pPr>
+        <w:spacing w:before="20" w:after="20"/>
+        <w:ind w:left="288"/>
+      </w:pPr>
+      <w:r>
+        <w:t>•    • Bloodborne Exposures (e.g., needle sticks, eye splashes): The exposed EMT must report the incident to their supervisor and initiate a formal post-exposure evaluation through the DICO immediately.</w:t>
       </w:r>
     </w:p>
     <w:p>
@@ -341,7 +358,7 @@
         <w:ind w:left="288"/>
       </w:pPr>
       <w:r>
-        <w:t>• Gloves: Medical-grade vinyl or nitrile gloves must be worn on EVERY patient contact. Avoid latex due to common provider and patient allergies. Change gloves between patients or if torn/heavily soiled.</w:t>
+        <w:t>• Medical Exam Gloves: High-quality nitrile or vinyl gloves must be donned prior to EVERY patient contact. Avoid latex gloves due to widespread provider and patient contact dermatitis/allergies.</w:t>
       </w:r>
     </w:p>
     <w:p>
@@ -350,7 +367,7 @@
         <w:ind w:left="288"/>
       </w:pPr>
       <w:r>
-        <w:t>• Proper Glove Removal Technique: Pinch the outside of one glove near the wrist, peel it down inside-out into a ball in the gloved hand. Slide an ungloved finger underneath the wrist of the remaining glove and peel it off inside-out over the first glove (glove-to-glove, skin-to-skin). Never touch the outside of a soiled glove with bare skin.</w:t>
+        <w:t>• Proper Glove Removal Technique: Glove-to-glove, skin-to-skin. Partially peel the first glove at the wrist, turning it inside-out into a ball in the gloved hand. Slide a bare finger under the second glove's wrist and pull it inside-out over the balled first glove. Never allow the soiled outer surface of either glove to touch bare skin.</w:t>
       </w:r>
     </w:p>
     <w:p>
@@ -359,7 +376,7 @@
         <w:ind w:left="288"/>
       </w:pPr>
       <w:r>
-        <w:t>• Eye &amp; Face Protection: Wrap-around safety glasses (ANSI Z87.1 approved) or full-face shields must be worn whenever blood or body fluids may splatter, spray, or splash (e.g., arterial bleeding, childbirth, suctioning, endotracheal intubation).</w:t>
+        <w:t>• Eye &amp; Face Protection: ANSI Z87.1 approved wrap-around eye protection or full-face shields are mandatory whenever blood, amniotic fluid, or secretions may splash, spray, or splatter (arterial hemorrhage, field delivery, airway suctioning, intubation).</w:t>
       </w:r>
     </w:p>
     <w:p>
@@ -368,25 +385,25 @@
         <w:ind w:left="288"/>
       </w:pPr>
       <w:r>
-        <w:t>• Respiratory Protection:</w:t>
+        <w:t>• Respiratory Protection Protocols:</w:t>
       </w:r>
     </w:p>
     <w:p>
       <w:pPr>
         <w:spacing w:before="20" w:after="20"/>
-        <w:ind w:left="576"/>
+        <w:ind w:left="288"/>
       </w:pPr>
       <w:r>
-        <w:t xml:space="preserve">   - Surgical Mask: Placed on the PATIENT with a suspected respiratory infection or cough to prevent droplet dispersal.</w:t>
+        <w:t>•    • Surgical Mask on the PATIENT: Placed over the mouth and nose of any coughing, sneezing, or febrile patient to control source droplet dispersion.</w:t>
       </w:r>
     </w:p>
     <w:p>
       <w:pPr>
         <w:spacing w:before="20" w:after="20"/>
-        <w:ind w:left="576"/>
+        <w:ind w:left="288"/>
       </w:pPr>
       <w:r>
-        <w:t xml:space="preserve">   - N95 or HEPA Respirator: Fit-tested particulate respirator worn by the EMT when caring for patients suspected of having airborne pathogens (especially Tuberculosis, COVID-19, Measles).</w:t>
+        <w:t>•    • N95 / HEPA Respirator on the EMT: Fit-tested particulate respirator worn by the provider whenever caring for patients with suspected airborne diseases (Tuberculosis, Measles, Varicella).</w:t>
       </w:r>
     </w:p>
     <w:p>
@@ -395,25 +412,25 @@
         <w:ind w:left="288"/>
       </w:pPr>
       <w:r>
-        <w:t>• Hand Hygiene (The Single Most Effective Infection Control Measure):</w:t>
+        <w:t>• Hand Hygiene (The Single Most Effective Infection Barrier):</w:t>
       </w:r>
     </w:p>
     <w:p>
       <w:pPr>
         <w:spacing w:before="20" w:after="20"/>
-        <w:ind w:left="576"/>
+        <w:ind w:left="288"/>
       </w:pPr>
       <w:r>
-        <w:t xml:space="preserve">   - Hand Washing: Wash with warm water and soap for a minimum of 20 seconds, creating friction over all surfaces, between fingers, and under nails. Mandatory when hands are visibly soiled or after treating patients with spore-forming organisms like Clostridium difficile (C. diff).</w:t>
+        <w:t>•    • Hand Washing: Wash with warm water and soap for a minimum of 20 seconds with vigorous mechanical friction across all surfaces, between digits, and under nail beds. Mandatory when hands are visibly dirty or after caring for patients with spore-forming organisms like Clostridium difficile.</w:t>
       </w:r>
     </w:p>
     <w:p>
       <w:pPr>
         <w:spacing w:before="20" w:after="20"/>
-        <w:ind w:left="576"/>
+        <w:ind w:left="288"/>
       </w:pPr>
       <w:r>
-        <w:t xml:space="preserve">   - Alcohol-Based Hand Sanitizers: Acceptable only when soap and water are unavailable and hands are not visibly dirty. Must contain at least 60% alcohol.</w:t>
+        <w:t>•    • Alcohol Sanitizers: Alcohol rubs (≥ 60% alcohol) are acceptable only when running water and soap are unavailable and hands are not visibly soiled.</w:t>
       </w:r>
     </w:p>
     <w:p>
@@ -437,37 +454,37 @@
     <w:p>
       <w:pPr>
         <w:spacing w:before="20" w:after="20"/>
-        <w:ind w:left="576"/>
+        <w:ind w:left="288"/>
       </w:pPr>
       <w:r>
-        <w:t xml:space="preserve">   - Cleaning: The mechanical removal of visible dirt and organic matter with soap and water.</w:t>
+        <w:t>•    • Cleaning: Mechanical removal of gross visible dirt and organic debris using soap and water.</w:t>
       </w:r>
     </w:p>
     <w:p>
       <w:pPr>
         <w:spacing w:before="20" w:after="20"/>
-        <w:ind w:left="576"/>
+        <w:ind w:left="288"/>
       </w:pPr>
       <w:r>
-        <w:t xml:space="preserve">   - Disinfection: The destruction of pathogenic microorganisms on inanimate objects using a chemical agent (e.g., hospital-grade EPA disinfectant or a 1:10 to 1:100 dilution of sodium hypochlorite / household bleach and water).</w:t>
+        <w:t>•    • Disinfection: Chemical elimination of virtually all recognized pathogenic microorganisms on inanimate surfaces using hospital-grade EPA disinfectants or a 1:10 to 1:100 household bleach-to-water dilution.</w:t>
       </w:r>
     </w:p>
     <w:p>
       <w:pPr>
         <w:spacing w:before="20" w:after="20"/>
-        <w:ind w:left="576"/>
+        <w:ind w:left="288"/>
       </w:pPr>
       <w:r>
-        <w:t xml:space="preserve">   - High-Level Disinfection: Kills all organisms except high numbers of bacterial spores.</w:t>
+        <w:t>•    • Sterilization: Complete destruction of all microbial life, including bacterial spores, achieved via high-pressure steam autoclaves.</w:t>
       </w:r>
     </w:p>
     <w:p>
       <w:pPr>
         <w:spacing w:before="20" w:after="20"/>
-        <w:ind w:left="576"/>
+        <w:ind w:left="288"/>
       </w:pPr>
       <w:r>
-        <w:t xml:space="preserve">   - Sterilization: Complete destruction of all microbial life, including spores, typically accomplished via an autoclave (steam under pressure).</w:t>
+        <w:t>• Regulated Medical Waste: Saturated, dripping dressings and blood products belong in red biohazard bags. Non-saturated exam gloves, wipes, and dry dressings may go into standard municipal trash.</w:t>
       </w:r>
     </w:p>
     <w:p>
@@ -476,16 +493,7 @@
         <w:ind w:left="288"/>
       </w:pPr>
       <w:r>
-        <w:t>• Regulated Medical Waste: Dispose of heavily saturated, dripping items in red biohazard bags. Non-saturated exam gloves and dressings may go in regular municipal trash unless local protocol dictates otherwise.</w:t>
-      </w:r>
-    </w:p>
-    <w:p>
-      <w:pPr>
-        <w:spacing w:before="20" w:after="20"/>
-        <w:ind w:left="288"/>
-      </w:pPr>
-      <w:r>
-        <w:t>• Sharps Safety: Immediately deposit used needles, IV catheters, lancets, and ampoules into rigid, puncture-resistant, red biohazard sharps containers. NEVER recap, bend, or break needles with your hands.</w:t>
+        <w:t>• Sharps Handling: Immediately deposit needles, IV stylets, lancets, and ampoules into rigid, puncture-proof red biohazard sharps containers. NEVER recap, bend, or break needles by hand.</w:t>
       </w:r>
     </w:p>
     <w:p>
@@ -503,7 +511,7 @@
         <w:ind w:left="288"/>
       </w:pPr>
       <w:r>
-        <w:t>• Hepatitis B: 3-dose series with post-vaccination titer check to confirm immunity.</w:t>
+        <w:t>• Hepatitis B: 3-dose vaccine series + post-vaccination titer to confirm protective antibody levels.</w:t>
       </w:r>
     </w:p>
     <w:p>
@@ -512,7 +520,7 @@
         <w:ind w:left="288"/>
       </w:pPr>
       <w:r>
-        <w:t>• Tdap: Tetanus, diphtheria, and acellular pertussis vaccine; tetanus booster required every 10 years.</w:t>
+        <w:t>• Tdap: Tetanus, diphtheria, acellular pertussis vaccine; booster required every 10 years.</w:t>
       </w:r>
     </w:p>
     <w:p>
@@ -521,7 +529,7 @@
         <w:ind w:left="288"/>
       </w:pPr>
       <w:r>
-        <w:t>• MMR: Measles, mumps, and rubella (2 doses or proof of immunity).</w:t>
+        <w:t>• MMR: Measles, mumps, rubella vaccine (2 doses or verified immunity).</w:t>
       </w:r>
     </w:p>
     <w:p>
@@ -530,7 +538,7 @@
         <w:ind w:left="288"/>
       </w:pPr>
       <w:r>
-        <w:t>• Varicella: Chickenpox vaccine (2 doses or documented history/titer).</w:t>
+        <w:t>• Varicella: Chickenpox vaccine (2 doses or verified titer).</w:t>
       </w:r>
     </w:p>
     <w:p>
@@ -539,7 +547,7 @@
         <w:ind w:left="288"/>
       </w:pPr>
       <w:r>
-        <w:t>• Influenza: Annual vaccination.</w:t>
+        <w:t>• Influenza: Annual seasonal immunization.</w:t>
       </w:r>
     </w:p>
     <w:p>
@@ -548,7 +556,7 @@
         <w:ind w:left="288"/>
       </w:pPr>
       <w:r>
-        <w:t>• Tuberculosis (TB) Surveillance: Annual baseline tuberculin skin test (PPD / Mantoux) or Interferon-Gamma Release Assay (IGRA blood test).</w:t>
+        <w:t>• Tuberculosis (TB) Surveillance: Annual baseline PPD Mantoux tuberculin skin test or IGRA blood assay.</w:t>
       </w:r>
     </w:p>
     <w:p>
@@ -566,31 +574,34 @@
         <w:ind w:left="288"/>
       </w:pPr>
       <w:r>
-        <w:t>• Physiological Stress Response: Hans Selye's General Adaptation Syndrome (GAS) identifies three phases:</w:t>
+        <w:t>• Hans Selye's Three-Stage Stress Model (General Adaptation Syndrome):</w:t>
       </w:r>
     </w:p>
     <w:p>
       <w:pPr>
         <w:spacing w:before="20" w:after="20"/>
+        <w:ind w:left="288"/>
       </w:pPr>
       <w:r>
-        <w:t xml:space="preserve">   1. Alarm Reaction: Immediate 'fight-or-flight' activation of the sympathetic nervous system and adrenal glands; catecholamines (epinephrine and norepinephrine) flood the bloodstream, increasing heart rate, respiratory rate, blood pressure, and mental alertness while dilating pupils.</w:t>
+        <w:t>•    1. Alarm Reaction: Immediate sympathetic fight-or-flight response; surge of catecholamines (epinephrine and norepinephrine); marked increase in heart rate, blood pressure, respiratory rate, pupillary dilation, and heightened sensory alertness.</w:t>
       </w:r>
     </w:p>
     <w:p>
       <w:pPr>
         <w:spacing w:before="20" w:after="20"/>
+        <w:ind w:left="288"/>
       </w:pPr>
       <w:r>
-        <w:t xml:space="preserve">   2. Stage of Resistance: The body adapts to the ongoing stressor, attempting to re-establish physiological equilibrium.</w:t>
+        <w:t>•    2. Stage of Resistance: The physiological attempt to adapt to ongoing stress and re-establish homeostasis.</w:t>
       </w:r>
     </w:p>
     <w:p>
       <w:pPr>
         <w:spacing w:before="20" w:after="20"/>
+        <w:ind w:left="288"/>
       </w:pPr>
       <w:r>
-        <w:t xml:space="preserve">   3. Stage of Exhaustion: Prolonged, unrelenting stress depletes physical and psychological reserves, leading to immune suppression, adrenal fatigue, and chronic illness.</w:t>
+        <w:t>•    3. Stage of Exhaustion: Prolonged, unmitigated exposure to stress depleting physical and psychological reserves; causes immune suppression, adrenal burnout, and chronic illness.</w:t>
       </w:r>
     </w:p>
     <w:p>
@@ -599,34 +610,34 @@
         <w:ind w:left="288"/>
       </w:pPr>
       <w:r>
-        <w:t>• The Three Stress Reaction Types:</w:t>
+        <w:t>• The Three Stress Reactions in EMS Practice:</w:t>
       </w:r>
     </w:p>
     <w:p>
       <w:pPr>
         <w:spacing w:before="20" w:after="20"/>
-        <w:ind w:left="576"/>
+        <w:ind w:left="288"/>
       </w:pPr>
       <w:r>
-        <w:t xml:space="preserve">   - Acute Stress Reaction: Occurs during or immediately after the high-stress event (e.g., mass casualty incident, pediatric cardiac arrest). Symptoms: sweating, tremor, tachycardia, acute focus or psychological paralysis.</w:t>
+        <w:t>•    • Acute Stress Reaction: Occurs during or immediately following a critical event; manifests as diaphoresis, tachycardia, tremors, tunnel vision, or psychological paralysis.</w:t>
       </w:r>
     </w:p>
     <w:p>
       <w:pPr>
         <w:spacing w:before="20" w:after="20"/>
-        <w:ind w:left="576"/>
+        <w:ind w:left="288"/>
       </w:pPr>
       <w:r>
-        <w:t xml:space="preserve">   - Delayed Stress Reaction: Manifests days, weeks, or months later. Archetype is Post-Traumatic Stress Disorder (PTSD). Characterized by intrusive flashbacks, nightmares, emotional blunting, hyperarousal, avoidance of triggers, and detachment.</w:t>
+        <w:t>•    • Delayed Stress Reaction (PTSD): Develops days, weeks, or months later; symptoms include intrusive flashbacks, nightmares, hypervigilance, emotional detachment, and avoidance of triggers.</w:t>
       </w:r>
     </w:p>
     <w:p>
       <w:pPr>
         <w:spacing w:before="20" w:after="20"/>
-        <w:ind w:left="576"/>
+        <w:ind w:left="288"/>
       </w:pPr>
       <w:r>
-        <w:t xml:space="preserve">   - Cumulative Stress Reaction: The gradual, insidious accumulation of daily unaddressed stressors over months or years. Leads to physical and emotional burnout, chronic exhaustion, cynicism, interpersonal conflict, depression, gastrointestinal ulcers, and substance abuse.</w:t>
+        <w:t>•    • Cumulative Stress Reaction (Burnout): The gradual, insidious accumulation of unaddressed daily micro-stressors over months or years; manifests as chronic fatigue, cynicism, irritability, gastrointestinal ulcers, depression, and substance misuse.</w:t>
       </w:r>
     </w:p>
     <w:p>
@@ -644,7 +655,7 @@
         <w:ind w:left="288"/>
       </w:pPr>
       <w:r>
-        <w:t>• CISM Concept: A comprehensive, multi-component crisis intervention system designed to assist emergency personnel in processing severe operational trauma.</w:t>
+        <w:t>• CISM Concept: A comprehensive, multi-component crisis intervention protocol designed to mitigate acute psychological trauma in emergency responders.</w:t>
       </w:r>
     </w:p>
     <w:p>
@@ -653,7 +664,7 @@
         <w:ind w:left="288"/>
       </w:pPr>
       <w:r>
-        <w:t>• Defusing: A brief, informal, confidential peer-led discussion held within 1 to 4 hours following the incident. Allows responders to vent emotions and receive initial coping strategies before going off duty.</w:t>
+        <w:t>• Defusing: A short, informal, confidential peer-led discussion conducted within 1 to 4 hours post-incident; allows crew members to express emotions and receive initial coping strategies before returning home.</w:t>
       </w:r>
     </w:p>
     <w:p>
@@ -662,7 +673,7 @@
         <w:ind w:left="288"/>
       </w:pPr>
       <w:r>
-        <w:t>• Critical Incident Stress Debriefing (CISD): A structured, 7-phase formal group meeting held 24 to 72 hours after the event, facilitated by trained mental health clinicians and peer counselors. Not an operational critique; focuses entirely on emotional and psychological health.</w:t>
+        <w:t>• Critical Incident Stress Debriefing (CISD): A formal, 7-phase group session held 24 to 72 hours after the event, facilitated by professional mental health clinicians and trained peer support teams.</w:t>
       </w:r>
     </w:p>
     <w:p>
@@ -671,7 +682,7 @@
         <w:ind w:left="288"/>
       </w:pPr>
       <w:r>
-        <w:t>• Mental Health Resources: Responders must recognize red flags for suicide. Resources include peer support teams, Employee Assistance Programs (EAP), and the 988 Suicide &amp; Crisis Lifeline.</w:t>
+        <w:t>• Suicide Awareness: Responders must remain alert for red flags in colleagues (social withdrawal, giving away personal gear, heavy drinking). Resources include agency EAP and the 988 Suicide &amp; Crisis Lifeline.</w:t>
       </w:r>
     </w:p>
     <w:p>
@@ -680,7 +691,7 @@
         <w:spacing w:before="160" w:after="40"/>
       </w:pPr>
       <w:r>
-        <w:t>1.9 Death, Dying &amp; The Grieving Process (Kübler-Ross)</w:t>
+        <w:t>1.9 Death, Dying &amp; Grieving (Kübler-Ross)</w:t>
       </w:r>
     </w:p>
     <w:p>
@@ -689,137 +700,97 @@
         <w:ind w:left="288"/>
       </w:pPr>
       <w:r>
-        <w:t>• The 5 Stages of Grief (Elisabeth Kübler-Ross Model):</w:t>
+        <w:t>• The 5 Stages of Grief: Denial ('This cannot be happening') → Anger ('Why did you take so long?!') → Bargaining ('God, take me instead') → Depression (Silent despair) → Acceptance (Reaching emotional resolution).</w:t>
       </w:r>
     </w:p>
     <w:p>
       <w:pPr>
         <w:spacing w:before="20" w:after="20"/>
+        <w:ind w:left="288"/>
       </w:pPr>
       <w:r>
-        <w:t xml:space="preserve">   1. Denial: Refusal to accept reality ('No, this cannot be happening, check him again!').</w:t>
+        <w:t>• Communicating with Grieving Families:</w:t>
       </w:r>
     </w:p>
     <w:p>
       <w:pPr>
         <w:spacing w:before="20" w:after="20"/>
+        <w:ind w:left="288"/>
       </w:pPr>
       <w:r>
-        <w:t xml:space="preserve">   2. Anger: Projecting fury onto responders or family ('Why took you so long? You killed him!').</w:t>
+        <w:t>•    • Maintain a calm, gentle, empathetic, and respectful demeanor.</w:t>
       </w:r>
     </w:p>
     <w:p>
       <w:pPr>
         <w:spacing w:before="20" w:after="20"/>
+        <w:ind w:left="288"/>
       </w:pPr>
       <w:r>
-        <w:t xml:space="preserve">   3. Bargaining: Attempting to postpone the inevitable ('God, if you save her, I will never drink again').</w:t>
+        <w:t>•    • Use clear, direct, and unambiguous language: state clearly that the patient has 'died' or is 'dead'.</w:t>
       </w:r>
     </w:p>
     <w:p>
       <w:pPr>
         <w:spacing w:before="20" w:after="20"/>
+        <w:ind w:left="288"/>
       </w:pPr>
       <w:r>
-        <w:t xml:space="preserve">   4. Depression: Overwhelming sadness, despair, and silent withdrawal.</w:t>
+        <w:t>•    • NEVER use euphemisms like 'passed away', 'we lost him', or 'he is in a better place'—they perpetuate denial and create profound confusion.</w:t>
       </w:r>
     </w:p>
     <w:p>
       <w:pPr>
         <w:spacing w:before="20" w:after="20"/>
+        <w:ind w:left="288"/>
       </w:pPr>
       <w:r>
-        <w:t xml:space="preserve">   5. Acceptance: Reaching emotional resolution and coming to terms with mortality.</w:t>
+        <w:t>•    • Do NOT provide false reassurances ('Everything will be fine' or 'I know exactly how you feel').</w:t>
       </w:r>
     </w:p>
     <w:p>
       <w:pPr>
-        <w:spacing w:before="20" w:after="20"/>
-        <w:ind w:left="288"/>
+        <w:pStyle w:val="Heading2"/>
+        <w:spacing w:before="160" w:after="40"/>
       </w:pPr>
       <w:r>
-        <w:t>• Interacting with Grieving Families:</w:t>
+        <w:t>1.10 Scene Safety, Physical Hazards &amp; Operational Awareness</w:t>
       </w:r>
     </w:p>
     <w:p>
       <w:pPr>
         <w:spacing w:before="20" w:after="20"/>
-        <w:ind w:left="576"/>
+        <w:ind w:left="288"/>
       </w:pPr>
       <w:r>
-        <w:t xml:space="preserve">   - Speak in a calm, clear, empathetic, and respectful tone.</w:t>
+        <w:t>• Traffic Incident Management: Highway collisions are among the leading causes of fatal EMS line-of-duty injuries. Position the apparatus in a protective 'fend-off' angle to shield the work area. Wear an ANSI/ISEA 107 Class 2 or 3 high-visibility safety vest.</w:t>
       </w:r>
     </w:p>
     <w:p>
       <w:pPr>
         <w:spacing w:before="20" w:after="20"/>
-        <w:ind w:left="576"/>
+        <w:ind w:left="288"/>
       </w:pPr>
       <w:r>
-        <w:t xml:space="preserve">   - Use unambiguous language: State clearly that the patient has 'died' or is 'dead'. NEVER use vague euphemisms like 'passed away', 'we lost him', or 'he is in a better place', which foster false hope and confusion.</w:t>
+        <w:t>• Downed Power Lines: Treat all downed wires as live and energized. Establish a wide danger zone beyond the wire's potential arc. Instruct vehicle occupants to remain inside the vehicle until the power utility confirms the line is de-energized, unless active fire threatens life.</w:t>
       </w:r>
     </w:p>
     <w:p>
       <w:pPr>
         <w:spacing w:before="20" w:after="20"/>
-        <w:ind w:left="576"/>
+        <w:ind w:left="288"/>
       </w:pPr>
       <w:r>
-        <w:t xml:space="preserve">   - Do not provide false reassurances (e.g., do NOT say 'I know exactly how you feel' or 'Everything will be fine').</w:t>
+        <w:t>• Hazardous Materials (Hazmat): Park uphill and upwind. Use binoculars from a safe distance to inspect NFPA 704 placards, DOT labels, and shipping manifests. Reference the DOT Emergency Response Guidebook (ERG). EMTs operate strictly in the Cold Zone (support zone); only Hazmat technicians operate in the Hot and Warm zones.</w:t>
       </w:r>
     </w:p>
     <w:p>
       <w:pPr>
         <w:spacing w:before="20" w:after="20"/>
-        <w:ind w:left="576"/>
+        <w:ind w:left="288"/>
       </w:pPr>
       <w:r>
-        <w:t xml:space="preserve">   - Allow family members to view the body if safe and appropriate, and provide comfort without rushing them.</w:t>
-      </w:r>
-    </w:p>
-    <w:p>
-      <w:pPr>
-        <w:pStyle w:val="Heading2"/>
-        <w:spacing w:before="160" w:after="40"/>
-      </w:pPr>
-      <w:r>
-        <w:t>1.10 Scene Safety &amp; Physical Operational Hazards</w:t>
-      </w:r>
-    </w:p>
-    <w:p>
-      <w:pPr>
-        <w:spacing w:before="20" w:after="20"/>
-        <w:ind w:left="288"/>
-      </w:pPr>
-      <w:r>
-        <w:t>• Traffic Incident Management: Vehicle collisions are among the leading causes of fatal injuries to EMTs. Always position the ambulance to shield the work area (fend-off position). Wear ANSI/ISEA 107 Class 2 or Class 3 high-visibility safety apparel.</w:t>
-      </w:r>
-    </w:p>
-    <w:p>
-      <w:pPr>
-        <w:spacing w:before="20" w:after="20"/>
-        <w:ind w:left="288"/>
-      </w:pPr>
-      <w:r>
-        <w:t>• Downed Power Lines: Treat ALL downed wires as live, energized lines. Establish a danger zone well beyond the arc of the wire. Instruct vehicle occupants to remain inside the vehicle until the power utility de-energizes the line, unless there is an imminent fire.</w:t>
-      </w:r>
-    </w:p>
-    <w:p>
-      <w:pPr>
-        <w:spacing w:before="20" w:after="20"/>
-        <w:ind w:left="288"/>
-      </w:pPr>
-      <w:r>
-        <w:t>• Hazardous Materials (Hazmat): Park uphill and upwind. Use binoculars from a safe distance to scan for NFPA 704 placards, DOT labels, and shipping manifests. Reference the Emergency Response Guidebook (ERG). EMTs operate strictly in the Cold Zone (support zone); only certified Hazmat technicians operate in the Hot (exclusion) and Warm (contamination reduction) zones.</w:t>
-      </w:r>
-    </w:p>
-    <w:p>
-      <w:pPr>
-        <w:spacing w:before="20" w:after="20"/>
-        <w:ind w:left="288"/>
-      </w:pPr>
-      <w:r>
-        <w:t>• Violence &amp; Crime Scenes: Never enter an unsecure scene where violence, weapons, or domestic disputes are suspected. 'Stage for Law Enforcement' several blocks away out of line-of-sight. Once cleared, maintain situational awareness, keep your back to walls, identify two exits, and preserve forensic evidence (cut around knife/bullet holes; place clothes in paper bags, never plastic).</w:t>
+        <w:t>• Violent Scenes: Stage for law enforcement (PD) several blocks away out of line-of-sight until the scene is officially secured. Once inside, maintain situational awareness, identify two exit routes, and preserve forensic evidence (cut around knife/bullet holes; place clothing in paper bags, never plastic).</w:t>
       </w:r>
     </w:p>
     <w:p>
@@ -851,7 +822,7 @@
         <w:ind w:left="288"/>
       </w:pPr>
       <w:r>
-        <w:t>• The Continuum of Care: The unbroken, seamless transition of patient care from the initial 911 dispatch, through field assessment, BLS/ALS interventions, ambulance transport, emergency department handover, definitive surgical/ICU management, to rehabilitation and home care.</w:t>
+        <w:t>• Continuum of Care: The unbroken, coordinated delivery of patient care across all operational phases—from 911 dispatch, on-scene BLS/ALS interventions, ambulance transport, emergency department handoff, ICU/surgical management, to rehabilitation and discharge.</w:t>
       </w:r>
     </w:p>
     <w:p>
@@ -860,7 +831,7 @@
         <w:ind w:left="288"/>
       </w:pPr>
       <w:r>
-        <w:t>• Community Paramedicine &amp; Mobile Integrated Healthcare (MIH): Modern evolution of EMS where experienced paramedics and EMTs provide proactive chronic disease monitoring, post-discharge follow-up, and home wellness visits to prevent avoidable hospital readmissions.</w:t>
+        <w:t>• Mobile Integrated Healthcare (MIH) &amp; Community Paramedicine: Proactive prehospital care model where experienced paramedics and EMTs perform home chronic disease monitoring and post-discharge check-ups to prevent avoidable hospital readmissions.</w:t>
       </w:r>
     </w:p>
     <w:p>
@@ -875,28 +846,28 @@
     <w:p>
       <w:pPr>
         <w:spacing w:before="20" w:after="20"/>
-        <w:ind w:left="576"/>
+        <w:ind w:left="288"/>
       </w:pPr>
       <w:r>
-        <w:t xml:space="preserve">   - Human Error: Inadvertent slip, lapse, or mistake (managed by console, review, and process improvement).</w:t>
+        <w:t>•    • Human Error: Inadvertent slip or honest mistake → Console, review, fix system design.</w:t>
       </w:r>
     </w:p>
     <w:p>
       <w:pPr>
         <w:spacing w:before="20" w:after="20"/>
-        <w:ind w:left="576"/>
+        <w:ind w:left="288"/>
       </w:pPr>
       <w:r>
-        <w:t xml:space="preserve">   - At-Risk Behavior: Choice where risk is not recognized or mistakenly believed to be justified (managed by coaching and training).</w:t>
+        <w:t>•    • At-Risk Behavior: Choice where risk is unrecognized or mistakenly thought justified → Coach and retrain.</w:t>
       </w:r>
     </w:p>
     <w:p>
       <w:pPr>
         <w:spacing w:before="20" w:after="20"/>
-        <w:ind w:left="576"/>
+        <w:ind w:left="288"/>
       </w:pPr>
       <w:r>
-        <w:t xml:space="preserve">   - Reckless Behavior: Conscious disregard of a substantial and unjustifiable safety risk (managed by disciplinary action).</w:t>
+        <w:t>•    • Reckless Behavior: Conscious disregard of a substantial and unjustifiable safety risk → Disciplinary action.</w:t>
       </w:r>
     </w:p>
     <w:p>
@@ -929,28 +900,28 @@
     <w:p>
       <w:pPr>
         <w:spacing w:before="20" w:after="20"/>
-        <w:ind w:left="576"/>
+        <w:ind w:left="288"/>
       </w:pPr>
       <w:r>
-        <w:t xml:space="preserve">   - Regular Teams: Providers who consistently train and work together with established routines and shared expectations (e.g., dedicated partner pairings on an engine or aid car).</w:t>
+        <w:t>•    • Regular Teams: Providers who consistently train and work together with established routines and shared expectations (e.g., dedicated partner pairings on an engine or aid car).</w:t>
       </w:r>
     </w:p>
     <w:p>
       <w:pPr>
         <w:spacing w:before="20" w:after="20"/>
-        <w:ind w:left="576"/>
+        <w:ind w:left="288"/>
       </w:pPr>
       <w:r>
-        <w:t xml:space="preserve">   - Temporary Teams: Providers who work together intermittently or have never met prior to the emergency call (e.g., volunteer duty shifts, mutual aid responses).</w:t>
+        <w:t>•    • Temporary Teams: Providers who work together intermittently or have never met prior to the emergency call (e.g., volunteer duty shifts, mutual aid responses).</w:t>
       </w:r>
     </w:p>
     <w:p>
       <w:pPr>
         <w:spacing w:before="20" w:after="20"/>
-        <w:ind w:left="576"/>
+        <w:ind w:left="288"/>
       </w:pPr>
       <w:r>
-        <w:t xml:space="preserve">   - Special Teams: Highly specialized units configured for specific operational domains (e.g., Hazmat, Tactical EMS, Search and Rescue, Bike teams, Critical Care Transport).</w:t>
+        <w:t>•    • Special Teams: Highly specialized units configured for specific operational domains (e.g., Hazmat, Tactical EMS, Search and Rescue, Bike teams, Critical Care Transport).</w:t>
       </w:r>
     </w:p>
     <w:p>
@@ -965,41 +936,46 @@
     <w:p>
       <w:pPr>
         <w:spacing w:before="20" w:after="20"/>
+        <w:ind w:left="288"/>
       </w:pPr>
       <w:r>
-        <w:t xml:space="preserve">   1. Shared Goal: A unified, unambiguous objective (e.g., 'achieve ROSC with neurologically intact survival').</w:t>
+        <w:t>•    1. Shared Goal: A unified, unambiguous objective (e.g., 'achieve ROSC with neurologically intact survival').</w:t>
       </w:r>
     </w:p>
     <w:p>
       <w:pPr>
         <w:spacing w:before="20" w:after="20"/>
+        <w:ind w:left="288"/>
       </w:pPr>
       <w:r>
-        <w:t xml:space="preserve">   2. Clear Roles &amp; Responsibilities: Each member knows exactly what task they own and who is leading.</w:t>
+        <w:t>•    2. Clear Roles &amp; Responsibilities: Each member knows exactly what task they own and who is leading.</w:t>
       </w:r>
     </w:p>
     <w:p>
       <w:pPr>
         <w:spacing w:before="20" w:after="20"/>
+        <w:ind w:left="288"/>
       </w:pPr>
       <w:r>
-        <w:t xml:space="preserve">   3. Diverse &amp; Complementary Skills: Capitalizing on the varying strengths and training of all crew members.</w:t>
+        <w:t>•    3. Diverse &amp; Complementary Skills: Capitalizing on the varying strengths and training of all crew members.</w:t>
       </w:r>
     </w:p>
     <w:p>
       <w:pPr>
         <w:spacing w:before="20" w:after="20"/>
+        <w:ind w:left="288"/>
       </w:pPr>
       <w:r>
-        <w:t xml:space="preserve">   4. Effective Communication: Transparent, respectful, and closed-loop dialogue.</w:t>
+        <w:t>•    4. Effective Communication: Transparent, respectful, and closed-loop dialogue.</w:t>
       </w:r>
     </w:p>
     <w:p>
       <w:pPr>
         <w:spacing w:before="20" w:after="20"/>
+        <w:ind w:left="288"/>
       </w:pPr>
       <w:r>
-        <w:t xml:space="preserve">   5. Measurable Outcomes: Continuous debriefing and metric tracking (e.g., chest compression fraction &gt; 80%).</w:t>
+        <w:t>•    5. Measurable Outcomes: Continuous debriefing and metric tracking (e.g., chest compression fraction &gt; 80%).</w:t>
       </w:r>
     </w:p>
     <w:p>
@@ -1041,37 +1017,37 @@
     <w:p>
       <w:pPr>
         <w:spacing w:before="20" w:after="20"/>
-        <w:ind w:left="576"/>
+        <w:ind w:left="288"/>
       </w:pPr>
       <w:r>
-        <w:t xml:space="preserve">   - Probe: Inquire gently ('Do you see the patient's oxygen saturation reading?').</w:t>
+        <w:t>•    • Probe: Inquire gently ('Do you see the patient's oxygen saturation reading?').</w:t>
       </w:r>
     </w:p>
     <w:p>
       <w:pPr>
         <w:spacing w:before="20" w:after="20"/>
-        <w:ind w:left="576"/>
+        <w:ind w:left="288"/>
       </w:pPr>
       <w:r>
-        <w:t xml:space="preserve">   - Alert: State the objective finding ('The SpO2 is dropping rapidly to 82%.').</w:t>
+        <w:t>•    • Alert: State the objective finding ('The SpO2 is dropping rapidly to 82%.').</w:t>
       </w:r>
     </w:p>
     <w:p>
       <w:pPr>
         <w:spacing w:before="20" w:after="20"/>
-        <w:ind w:left="576"/>
+        <w:ind w:left="288"/>
       </w:pPr>
       <w:r>
-        <w:t xml:space="preserve">   - Challenge: Direct confrontation of the action ('We must stop the intubation attempt and ventilate with the BVM immediately.').</w:t>
+        <w:t>•    • Challenge: Direct confrontation of the action ('We must stop the intubation attempt and ventilate with the BVM immediately.').</w:t>
       </w:r>
     </w:p>
     <w:p>
       <w:pPr>
         <w:spacing w:before="20" w:after="20"/>
-        <w:ind w:left="576"/>
+        <w:ind w:left="288"/>
       </w:pPr>
       <w:r>
-        <w:t xml:space="preserve">   - Emergency: Direct intervention to stop harm ('Stop! Stand down, I am taking the airway to ventilate now!').</w:t>
+        <w:t>•    • Emergency: Direct intervention to stop harm ('Stop! Stand down, I am taking the airway to ventilate now!').</w:t>
       </w:r>
     </w:p>
     <w:p>
@@ -1113,41 +1089,46 @@
     <w:p>
       <w:pPr>
         <w:spacing w:before="20" w:after="20"/>
+        <w:ind w:left="288"/>
       </w:pPr>
       <w:r>
-        <w:t xml:space="preserve">   1. Uninterrupted Critical Care: Ongoing interventions (CPR, ventilations, hemorrhage control) must not stop during verbal reports.</w:t>
+        <w:t>•    1. Uninterrupted Critical Care: Ongoing interventions (CPR, ventilations, hemorrhage control) must not stop during verbal reports.</w:t>
       </w:r>
     </w:p>
     <w:p>
       <w:pPr>
         <w:spacing w:before="20" w:after="20"/>
+        <w:ind w:left="288"/>
       </w:pPr>
       <w:r>
-        <w:t xml:space="preserve">   2. Minimal Distractions: Dedicated verbal exchange in a quiet, focused area without cross-talk.</w:t>
+        <w:t>•    2. Minimal Distractions: Dedicated verbal exchange in a quiet, focused area without cross-talk.</w:t>
       </w:r>
     </w:p>
     <w:p>
       <w:pPr>
         <w:spacing w:before="20" w:after="20"/>
+        <w:ind w:left="288"/>
       </w:pPr>
       <w:r>
-        <w:t xml:space="preserve">   3. Mutual Respect: Two-way collaborative interaction between prehospital and hospital personnel.</w:t>
+        <w:t>•    3. Mutual Respect: Two-way collaborative interaction between prehospital and hospital personnel.</w:t>
       </w:r>
     </w:p>
     <w:p>
       <w:pPr>
         <w:spacing w:before="20" w:after="20"/>
+        <w:ind w:left="288"/>
       </w:pPr>
       <w:r>
-        <w:t xml:space="preserve">   4. Common Language / Standardized Format: Utilizing standardized handover frameworks (SBAR or MIST).</w:t>
+        <w:t>•    4. Common Language / Standardized Format: Utilizing standardized handover frameworks (SBAR or MIST).</w:t>
       </w:r>
     </w:p>
     <w:p>
       <w:pPr>
         <w:spacing w:before="20" w:after="20"/>
+        <w:ind w:left="288"/>
       </w:pPr>
       <w:r>
-        <w:t xml:space="preserve">   5. Acknowledgment &amp; Transfer Confirmation: The receiving provider explicitly states they accept responsibility for the patient.</w:t>
+        <w:t>•    5. Acknowledgment &amp; Transfer Confirmation: The receiving provider explicitly states they accept responsibility for the patient.</w:t>
       </w:r>
     </w:p>
     <w:p>
@@ -1162,37 +1143,37 @@
     <w:p>
       <w:pPr>
         <w:spacing w:before="20" w:after="20"/>
-        <w:ind w:left="576"/>
+        <w:ind w:left="288"/>
       </w:pPr>
       <w:r>
-        <w:t xml:space="preserve">   - Situation: Patient age, sex, chief complaint, primary life threat.</w:t>
+        <w:t>•    • Situation: Patient age, sex, chief complaint, primary life threat.</w:t>
       </w:r>
     </w:p>
     <w:p>
       <w:pPr>
         <w:spacing w:before="20" w:after="20"/>
-        <w:ind w:left="576"/>
+        <w:ind w:left="288"/>
       </w:pPr>
       <w:r>
-        <w:t xml:space="preserve">   - Background: Pertinent medical history, medications, allergies, events leading up.</w:t>
+        <w:t>•    • Background: Pertinent medical history, medications, allergies, events leading up.</w:t>
       </w:r>
     </w:p>
     <w:p>
       <w:pPr>
         <w:spacing w:before="20" w:after="20"/>
-        <w:ind w:left="576"/>
+        <w:ind w:left="288"/>
       </w:pPr>
       <w:r>
-        <w:t xml:space="preserve">   - Assessment: Baseline and current vitals, physical findings, interventions performed.</w:t>
+        <w:t>•    • Assessment: Baseline and current vitals, physical findings, interventions performed.</w:t>
       </w:r>
     </w:p>
     <w:p>
       <w:pPr>
         <w:spacing w:before="20" w:after="20"/>
-        <w:ind w:left="576"/>
+        <w:ind w:left="288"/>
       </w:pPr>
       <w:r>
-        <w:t xml:space="preserve">   - Recommendation: Pending treatments, requested physician orders, suggested immediate diagnostics.</w:t>
+        <w:t>•    • Recommendation: Pending treatments, requested physician orders, suggested immediate diagnostics.</w:t>
       </w:r>
     </w:p>
     <w:p>
@@ -1225,19 +1206,19 @@
     <w:p>
       <w:pPr>
         <w:spacing w:before="20" w:after="20"/>
-        <w:ind w:left="576"/>
+        <w:ind w:left="288"/>
       </w:pPr>
       <w:r>
-        <w:t xml:space="preserve">   - Type 1 (Intuitive / Heuristic): Rapid, automatic, pattern-recognition based on past experience (e.g., seasoned paramedic recognizing anaphylaxis at a glance). Highly efficient, but prone to cognitive traps.</w:t>
+        <w:t>•    • Type 1 (Intuitive / Heuristic): Rapid, automatic, pattern-recognition based on past experience (e.g., seasoned paramedic recognizing anaphylaxis at a glance). Highly efficient, but prone to cognitive traps.</w:t>
       </w:r>
     </w:p>
     <w:p>
       <w:pPr>
         <w:spacing w:before="20" w:after="20"/>
-        <w:ind w:left="576"/>
+        <w:ind w:left="288"/>
       </w:pPr>
       <w:r>
-        <w:t xml:space="preserve">   - Type 2 (Analytical / Deliberate): Slow, methodical, systematic rule-based evaluation (e.g., following a diagnostic flowchart). Demands more cognitive energy but prevents diagnostic tunnel vision.</w:t>
+        <w:t>•    • Type 2 (Analytical / Deliberate): Slow, methodical, systematic rule-based evaluation (e.g., following a diagnostic flowchart). Demands more cognitive energy but prevents diagnostic tunnel vision.</w:t>
       </w:r>
     </w:p>
     <w:p>
@@ -1252,37 +1233,37 @@
     <w:p>
       <w:pPr>
         <w:spacing w:before="20" w:after="20"/>
-        <w:ind w:left="576"/>
+        <w:ind w:left="288"/>
       </w:pPr>
       <w:r>
-        <w:t xml:space="preserve">   - Confirmation Bias: Seeking only clues that support your initial diagnostic hunch while ignoring contradictory evidence (e.g., diagnosing panic attack in a young female while ignoring tachypnea caused by pulmonary embolism).</w:t>
+        <w:t>•    • Confirmation Bias: Seeking only clues that support your initial diagnostic hunch while ignoring contradictory evidence (e.g., diagnosing panic attack in a young female while ignoring tachypnea caused by pulmonary embolism).</w:t>
       </w:r>
     </w:p>
     <w:p>
       <w:pPr>
         <w:spacing w:before="20" w:after="20"/>
-        <w:ind w:left="576"/>
+        <w:ind w:left="288"/>
       </w:pPr>
       <w:r>
-        <w:t xml:space="preserve">   - Anchoring Bias: Fixating on the first piece of information received (e.g., dispatch note 'intoxicated subject') and failing to recognize hypoglycemia or subdural hematoma.</w:t>
+        <w:t>•    • Anchoring Bias: Fixating on the first piece of information received (e.g., dispatch note 'intoxicated subject') and failing to recognize hypoglycemia or subdural hematoma.</w:t>
       </w:r>
     </w:p>
     <w:p>
       <w:pPr>
         <w:spacing w:before="20" w:after="20"/>
-        <w:ind w:left="576"/>
+        <w:ind w:left="288"/>
       </w:pPr>
       <w:r>
-        <w:t xml:space="preserve">   - Overconfidence Trap: Believing one's clinical judgment is infallible without verifying vital signs or blood glucose.</w:t>
+        <w:t>•    • Overconfidence Trap: Believing one's clinical judgment is infallible without verifying vital signs or blood glucose.</w:t>
       </w:r>
     </w:p>
     <w:p>
       <w:pPr>
         <w:spacing w:before="20" w:after="20"/>
-        <w:ind w:left="576"/>
+        <w:ind w:left="288"/>
       </w:pPr>
       <w:r>
-        <w:t xml:space="preserve">   - Deference to Authority: Junior EMT noticing an impending error by a senior paramedic but remaining silent out of intimidation.</w:t>
+        <w:t>•    • Deference to Authority: Junior EMT noticing an impending error by a senior paramedic but remaining silent out of intimidation.</w:t>
       </w:r>
     </w:p>
     <w:p>
@@ -1306,46 +1287,46 @@
     <w:p>
       <w:pPr>
         <w:spacing w:before="20" w:after="20"/>
-        <w:ind w:left="576"/>
+        <w:ind w:left="288"/>
       </w:pPr>
       <w:r>
-        <w:t xml:space="preserve">   - Equipment Assembly &amp; Check: Laryngoscope handle and blades (Macintosh curved vs. Miller straight; check bulb for 'white, bright, tight' illumination); Endotracheal (ET) tube of proper size (usually 7.0–8.0 mm for adults); malleable stylet inserted (stop 1 cm proximal to Murphy eye); 10 mL syringe (test cuff inflation and integrity); commercial tube securement device; suction unit with rigid Yankauer tip; BVM with reservoir attached to high-flow O2; water-soluble lubricant; continuous waveform capnography and colorimetric ETCO2 detector.</w:t>
+        <w:t>•    • Equipment Assembly &amp; Check: Laryngoscope handle and blades (Macintosh curved vs. Miller straight; check bulb for 'white, bright, tight' illumination); Endotracheal (ET) tube of proper size (usually 7.0–8.0 mm for adults); malleable stylet inserted (stop 1 cm proximal to Murphy eye); 10 mL syringe (test cuff inflation and integrity); commercial tube securement device; suction unit with rigid Yankauer tip; BVM with reservoir attached to high-flow O2; water-soluble lubricant; continuous waveform capnography and colorimetric ETCO2 detector.</w:t>
       </w:r>
     </w:p>
     <w:p>
       <w:pPr>
         <w:spacing w:before="20" w:after="20"/>
-        <w:ind w:left="576"/>
+        <w:ind w:left="288"/>
       </w:pPr>
       <w:r>
-        <w:t xml:space="preserve">   - Pre-Oxygenation: Deliver high-flow oxygen for 2–3 minutes prior to attempt via BVM or high-flow nasal cannula (apneic oxygenation).</w:t>
+        <w:t>•    • Pre-Oxygenation: Deliver high-flow oxygen for 2–3 minutes prior to attempt via BVM or high-flow nasal cannula (apneic oxygenation).</w:t>
       </w:r>
     </w:p>
     <w:p>
       <w:pPr>
         <w:spacing w:before="20" w:after="20"/>
-        <w:ind w:left="576"/>
+        <w:ind w:left="288"/>
       </w:pPr>
       <w:r>
-        <w:t xml:space="preserve">   - Positioning: Place the patient's head in the 'sniffing position' (earlobe aligned with sternal notch) unless trauma/c-spine precautions dictate neutral in-line stabilization.</w:t>
+        <w:t>•    • Positioning: Place the patient's head in the 'sniffing position' (earlobe aligned with sternal notch) unless trauma/c-spine precautions dictate neutral in-line stabilization.</w:t>
       </w:r>
     </w:p>
     <w:p>
       <w:pPr>
         <w:spacing w:before="20" w:after="20"/>
-        <w:ind w:left="576"/>
+        <w:ind w:left="288"/>
       </w:pPr>
       <w:r>
-        <w:t xml:space="preserve">   - External Laryngeal Manipulation (BURP Maneuver): The EMT applies Backward, Upward, and Rightward Pressure on the patient's thyroid cartilage as directed by the intubator to bring the vocal cords into view.</w:t>
+        <w:t>•    • External Laryngeal Manipulation (BURP Maneuver): The EMT applies Backward, Upward, and Rightward Pressure on the patient's thyroid cartilage as directed by the intubator to bring the vocal cords into view.</w:t>
       </w:r>
     </w:p>
     <w:p>
       <w:pPr>
         <w:spacing w:before="20" w:after="20"/>
-        <w:ind w:left="576"/>
+        <w:ind w:left="288"/>
       </w:pPr>
       <w:r>
-        <w:t xml:space="preserve">   - Confirmation of Placement: Continuous waveform capnography (gold standard, normal 35–45 mmHg with rectangular waveform); 5-point auscultation (must hear epigastric silence first, followed by clear, equal bilateral breath sounds in the apices and bases); symmetrical chest rise; condensation inside the tube.</w:t>
+        <w:t>•    • Confirmation of Placement: Continuous waveform capnography (gold standard, normal 35–45 mmHg with rectangular waveform); 5-point auscultation (must hear epigastric silence first, followed by clear, equal bilateral breath sounds in the apices and bases); symmetrical chest rise; condensation inside the tube.</w:t>
       </w:r>
     </w:p>
     <w:p>
@@ -1360,37 +1341,37 @@
     <w:p>
       <w:pPr>
         <w:spacing w:before="20" w:after="20"/>
-        <w:ind w:left="576"/>
+        <w:ind w:left="288"/>
       </w:pPr>
       <w:r>
-        <w:t xml:space="preserve">   - IV Setup Procedure: Inspect IV fluid bag (0.9% Normal Saline or Lactated Ringer's) for clarity, leaks, and expiration date; select administration tubing (Macro-drip 10–15 gtt/mL for trauma/hypotension fluid resuscitation vs. Micro-drip 60 gtt/mL for medication infusions/pediatrics); spike the bag sterilely; squeeze drip chamber until half full; open roller clamp to flush ALL air from the line; close clamp.</w:t>
+        <w:t>•    • IV Setup Procedure: Inspect IV fluid bag (0.9% Normal Saline or Lactated Ringer's) for clarity, leaks, and expiration date; select administration tubing (Macro-drip 10–15 gtt/mL for trauma/hypotension fluid resuscitation vs. Micro-drip 60 gtt/mL for medication infusions/pediatrics); spike the bag sterilely; squeeze drip chamber until half full; open roller clamp to flush ALL air from the line; close clamp.</w:t>
       </w:r>
     </w:p>
     <w:p>
       <w:pPr>
         <w:spacing w:before="20" w:after="20"/>
-        <w:ind w:left="576"/>
+        <w:ind w:left="288"/>
       </w:pPr>
       <w:r>
-        <w:t xml:space="preserve">   - Assisting the Paramedic: Prepare venous constricting band (tourniquet), alcohol/chlorhexidine prep pads, IV catheters (14G–16G for massive trauma/shock, 18G–20G for routine medical), extension set/saline flush, and transparent occlusive dressing (Tegaderm).</w:t>
+        <w:t>•    • Assisting the Paramedic: Prepare venous constricting band (tourniquet), alcohol/chlorhexidine prep pads, IV catheters (14G–16G for massive trauma/shock, 18G–20G for routine medical), extension set/saline flush, and transparent occlusive dressing (Tegaderm).</w:t>
       </w:r>
     </w:p>
     <w:p>
       <w:pPr>
         <w:spacing w:before="20" w:after="20"/>
-        <w:ind w:left="576"/>
+        <w:ind w:left="288"/>
       </w:pPr>
       <w:r>
-        <w:t xml:space="preserve">   - Intraosseous (IO) Access: Used when peripheral IV access cannot be established rapidly in critically ill patients. Landmarks: Proximal tibia (1 fingerbreadth medial to tibial tuberosity), humeral head, distal tibia. Have pressure infuser bag ready because bone marrow space exhibits high internal resistance.</w:t>
+        <w:t>•    • Intraosseous (IO) Access: Used when peripheral IV access cannot be established rapidly in critically ill patients. Landmarks: Proximal tibia (1 fingerbreadth medial to tibial tuberosity), humeral head, distal tibia. Have pressure infuser bag ready because bone marrow space exhibits high internal resistance.</w:t>
       </w:r>
     </w:p>
     <w:p>
       <w:pPr>
         <w:spacing w:before="20" w:after="20"/>
-        <w:ind w:left="576"/>
+        <w:ind w:left="288"/>
       </w:pPr>
       <w:r>
-        <w:t xml:space="preserve">   - Monitoring the IV Line: Continuously observe for infiltration (catheter slips out of vein into surrounding subcutaneous tissue, causing cold, pale, swollen, tender tissue at insertion site—clamp and notify ALS immediately). Check for air in line, kinked tubing, or closed roller clamp.</w:t>
+        <w:t>•    • Monitoring the IV Line: Continuously observe for infiltration (catheter slips out of vein into surrounding subcutaneous tissue, causing cold, pale, swollen, tender tissue at insertion site—clamp and notify ALS immediately). Check for air in line, kinked tubing, or closed roller clamp.</w:t>
       </w:r>
     </w:p>
     <w:p>
@@ -1404,156 +1385,7 @@
         <w:spacing w:before="240" w:after="80"/>
       </w:pPr>
       <w:r>
-        <w:t>MODULE 3: BLOCK #3 PRACTICAL SKILLS LAB BLUEPRINT</w:t>
-      </w:r>
-    </w:p>
-    <w:p>
-      <w:pPr>
-        <w:spacing w:before="20" w:after="20"/>
-        <w:ind w:left="288"/>
-      </w:pPr>
-      <w:r>
-        <w:t>• Skill Sheet #21: Patient Assessment (Trauma) — 10-Minute Choreography</w:t>
-      </w:r>
-    </w:p>
-    <w:p>
-      <w:pPr>
-        <w:spacing w:before="20" w:after="20"/>
-        <w:ind w:left="576"/>
-      </w:pPr>
-      <w:r>
-        <w:t xml:space="preserve">   - BSI / Scene Safety: Full PPE, evaluate MOI, determine # of patients, request ALS, consider c-spine.</w:t>
-      </w:r>
-    </w:p>
-    <w:p>
-      <w:pPr>
-        <w:spacing w:before="20" w:after="20"/>
-        <w:ind w:left="576"/>
-      </w:pPr>
-      <w:r>
-        <w:t xml:space="preserve">   - Primary Assessment (XABC): Immediate exsanguinating hemorrhage control (tourniquet / wound packing); Airway (jaw-thrust, suction); Breathing (equal chest rise, high-flow O2 / BVM, occlusive dressing for open chest wound); Circulation (carotid vs radial pulses, skin color/temp/condition, major sweeps); Disability (AVPU, GCS, pupils); Expose &amp; Warm.</w:t>
-      </w:r>
-    </w:p>
-    <w:p>
-      <w:pPr>
-        <w:spacing w:before="20" w:after="20"/>
-        <w:ind w:left="576"/>
-      </w:pPr>
-      <w:r>
-        <w:t xml:space="preserve">   - Rapid Secondary Exam: Full DCAP-BTLS head-to-toe sweep, pelvic stability check (push gently in and down ONCE; never rock pelvis if unstable), bilateral lung sounds, back sweep and log-roll.</w:t>
-      </w:r>
-    </w:p>
-    <w:p>
-      <w:pPr>
-        <w:spacing w:before="20" w:after="20"/>
-        <w:ind w:left="288"/>
-      </w:pPr>
-      <w:r>
-        <w:t>• Skill Sheet #25: CPR / AED Management (High-Performance BLS)</w:t>
-      </w:r>
-    </w:p>
-    <w:p>
-      <w:pPr>
-        <w:spacing w:before="20" w:after="20"/>
-        <w:ind w:left="576"/>
-      </w:pPr>
-      <w:r>
-        <w:t xml:space="preserve">   - Compression Rate: 100 to 120 compressions per minute.</w:t>
-      </w:r>
-    </w:p>
-    <w:p>
-      <w:pPr>
-        <w:spacing w:before="20" w:after="20"/>
-        <w:ind w:left="576"/>
-      </w:pPr>
-      <w:r>
-        <w:t xml:space="preserve">   - Compression Depth: At least 2.0 to 2.4 inches (5–6 cm) in adults; allow full recoil between compressions.</w:t>
-      </w:r>
-    </w:p>
-    <w:p>
-      <w:pPr>
-        <w:spacing w:before="20" w:after="20"/>
-        <w:ind w:left="576"/>
-      </w:pPr>
-      <w:r>
-        <w:t xml:space="preserve">   - Chest Compression Fraction (CCF): Must maintain CCF &gt; 80% (minimize all pauses to &lt; 10 seconds).</w:t>
-      </w:r>
-    </w:p>
-    <w:p>
-      <w:pPr>
-        <w:spacing w:before="20" w:after="20"/>
-        <w:ind w:left="576"/>
-      </w:pPr>
-      <w:r>
-        <w:t xml:space="preserve">   - AED Application: Apply pads immediately upon arrival; resume compressions while AED charges; ensure 'All Clear' before shock delivery; resume compressions IMMEDIATELY following shock without pulse check.</w:t>
-      </w:r>
-    </w:p>
-    <w:p>
-      <w:pPr>
-        <w:spacing w:before="20" w:after="20"/>
-        <w:ind w:left="288"/>
-      </w:pPr>
-      <w:r>
-        <w:t>• Skill Sheets #57 &amp; #65: Aspirin &amp; Nitroglycerin Administration</w:t>
-      </w:r>
-    </w:p>
-    <w:p>
-      <w:pPr>
-        <w:spacing w:before="20" w:after="20"/>
-        <w:ind w:left="576"/>
-      </w:pPr>
-      <w:r>
-        <w:t xml:space="preserve">   - Aspirin (Skill #57): 324 mg chewable PO. Verify no active GI bleeding, no aspirin allergy. Instruct patient to chew thoroughly.</w:t>
-      </w:r>
-    </w:p>
-    <w:p>
-      <w:pPr>
-        <w:spacing w:before="20" w:after="20"/>
-        <w:ind w:left="576"/>
-      </w:pPr>
-      <w:r>
-        <w:t xml:space="preserve">   - Nitroglycerin (Skill #65): 0.4 mg SL tablet or spray. Mandatory preconditions: Systolic BP &gt; 100 mmHg, no ED medications within 24–48 hours (Viagra/Levitra 24h, Cialis 48h). Recheck vitals and pain score 5 minutes post-dose. Max 3 doses total.</w:t>
-      </w:r>
-    </w:p>
-    <w:p>
-      <w:pPr>
-        <w:spacing w:before="20" w:after="20"/>
-        <w:ind w:left="288"/>
-      </w:pPr>
-      <w:r>
-        <w:t>• Skill Sheets #61 &amp; #73: Oral Glucose &amp; Blood Glucometry (BGM)</w:t>
-      </w:r>
-    </w:p>
-    <w:p>
-      <w:pPr>
-        <w:spacing w:before="20" w:after="20"/>
-        <w:ind w:left="576"/>
-      </w:pPr>
-      <w:r>
-        <w:t xml:space="preserve">   - Blood Glucometry (Skill #73): Cleanse puncture site, prime lancet, wipe away first drop of blood with sterile gauze, apply second drop to test strip. Normal: 70–120 mg/dL.</w:t>
-      </w:r>
-    </w:p>
-    <w:p>
-      <w:pPr>
-        <w:spacing w:before="20" w:after="20"/>
-        <w:ind w:left="576"/>
-      </w:pPr>
-      <w:r>
-        <w:t xml:space="preserve">   - Oral Glucose (Skill #61): Indicated for BGL &lt; 60 mg/dL with intact consciousness and ability to swallow. Administer 15–25 g gel buccally (between cheek and gum) using a tongue depressor or direct squeeze.</w:t>
-      </w:r>
-    </w:p>
-    <w:p>
-      <w:r>
-        <w:br w:type="page"/>
-      </w:r>
-    </w:p>
-    <w:p>
-      <w:pPr>
-        <w:pStyle w:val="Heading1"/>
-        <w:spacing w:before="240" w:after="80"/>
-      </w:pPr>
-      <w:r>
-        <w:t>MODULE 4: INSTRUCTOR POP QUIZ &amp; ORAL BOARD HIT LIST</w:t>
+        <w:t>MODULE 3: TONIGHT'S IN-CLASS QUIZ ITEMS &amp; CLINICAL RATIONALES</w:t>
       </w:r>
     </w:p>
     <w:p>
@@ -1565,7 +1397,7 @@
           <w:b/>
           <w:color w:val="102C57"/>
         </w:rPr>
-        <w:t>1. What is the single most effective way to prevent the spread of infectious disease?</w:t>
+        <w:t>Question 3: Postpartum Bleeding Cessation Following Fundal Massage and Nursing</w:t>
         <w:br/>
       </w:r>
     </w:p>
@@ -1575,7 +1407,7 @@
         <w:ind w:left="360"/>
       </w:pPr>
       <w:r>
-        <w:t>A. Wearing heavy turnout gloves</w:t>
+        <w:t>A. Partial placental retention in the uterus</w:t>
       </w:r>
     </w:p>
     <w:p>
@@ -1584,7 +1416,7 @@
         <w:ind w:left="360"/>
       </w:pPr>
       <w:r>
-        <w:t>B. Washing hands with warm water and soap for at least 20 seconds</w:t>
+        <w:t>B. Release of oxytocin stimulating uterine contractions</w:t>
       </w:r>
     </w:p>
     <w:p>
@@ -1593,7 +1425,7 @@
         <w:ind w:left="360"/>
       </w:pPr>
       <w:r>
-        <w:t>C. Spraying ambulance surfaces with air freshener</w:t>
+        <w:t>C. Increased uterine perfusion caused by massage</w:t>
       </w:r>
     </w:p>
     <w:p>
@@ -1602,7 +1434,7 @@
         <w:ind w:left="360"/>
       </w:pPr>
       <w:r>
-        <w:t>D. Using an N95 respirator on every patient</w:t>
+        <w:t>D. Dilation of uterine vasculature from nursing</w:t>
       </w:r>
     </w:p>
     <w:p>
@@ -1621,17 +1453,17 @@
         <w:rPr>
           <w:b/>
         </w:rPr>
-        <w:t>B. Washing hands with warm water and soap for at least 20 seconds</w:t>
+        <w:t>B. Release of oxytocin stimulating uterine contractions</w:t>
         <w:br/>
       </w:r>
       <w:r>
         <w:rPr>
           <w:b/>
         </w:rPr>
-        <w:t xml:space="preserve">Rationale: </w:t>
+        <w:t xml:space="preserve">Clinical Rationale: </w:t>
       </w:r>
       <w:r>
-        <w:t>The CDC and OSHA recognize proper hand hygiene with soap and water (creating friction for at least 20 seconds) as the single most critical and effective barrier against infectious disease transmission.</w:t>
+        <w:t>Infant suckling at the breast stimulates the maternal posterior pituitary gland to secrete oxytocin, a natural hormone that stimulates smooth muscle contractions of the myometrium. Combined with manual fundal massage, this causes the uterus to contract down firmly (uterine involution), clamping shut the open, bleeding uterine spiral arteries at the placental detachment site and controlling postpartum bleeding.</w:t>
       </w:r>
     </w:p>
     <w:p>
@@ -1643,7 +1475,7 @@
           <w:b/>
           <w:color w:val="102C57"/>
         </w:rPr>
-        <w:t>2. An EMT is exposed to a patient's blood via a deep needle stick from an IV catheter. Under the Ryan White Comprehensive AIDS Resources Emergency Act, what is the EMT's immediate responsibility?</w:t>
+        <w:t>Question 4: Distinguishing Features of Braxton-Hicks Contractions</w:t>
         <w:br/>
       </w:r>
     </w:p>
@@ -1653,7 +1485,7 @@
         <w:ind w:left="360"/>
       </w:pPr>
       <w:r>
-        <w:t>A. Wait 48 hours to see if symptoms develop</w:t>
+        <w:t>A. Presence of bloody show alongside contractions</w:t>
       </w:r>
     </w:p>
     <w:p>
@@ -1662,7 +1494,7 @@
         <w:ind w:left="360"/>
       </w:pPr>
       <w:r>
-        <w:t>B. Contact the local police department to arrest the patient</w:t>
+        <w:t>B. Regular uterine contractions building in intensity</w:t>
       </w:r>
     </w:p>
     <w:p>
@@ -1671,7 +1503,7 @@
         <w:ind w:left="360"/>
       </w:pPr>
       <w:r>
-        <w:t>C. Immediately report the exposure to the designated infection control officer (DICO) and initiate post-exposure medical evaluation</w:t>
+        <w:t>C. Amniotic membrane rupture immediately preceding contractions</w:t>
       </w:r>
     </w:p>
     <w:p>
@@ -1680,7 +1512,7 @@
         <w:ind w:left="360"/>
       </w:pPr>
       <w:r>
-        <w:t>D. Demand an immediate on-scene cash settlement from the hospital</w:t>
+        <w:t>D. Pain relief achieved through movement or positional changes</w:t>
       </w:r>
     </w:p>
     <w:p>
@@ -1699,17 +1531,17 @@
         <w:rPr>
           <w:b/>
         </w:rPr>
-        <w:t>C. Immediately report the exposure to the designated infection control officer (DICO) and initiate post-exposure medical evaluation</w:t>
+        <w:t>D. Pain relief achieved through movement or positional changes</w:t>
         <w:br/>
       </w:r>
       <w:r>
         <w:rPr>
           <w:b/>
         </w:rPr>
-        <w:t xml:space="preserve">Rationale: </w:t>
+        <w:t xml:space="preserve">Clinical Rationale: </w:t>
       </w:r>
       <w:r>
-        <w:t>The Ryan White Act mandates that bloodborne exposures be reported immediately through the agency's DICO so that confidential medical evaluation, source testing, and prophylactic therapy can begin without delay.</w:t>
+        <w:t>False labor (Braxton-Hicks contractions) is characterized by irregular contractions that do not increase in duration or intensity, remain localized to the lower abdomen, and typically alleviate or resolve when the patient changes position, walks, or rests. In contrast, true labor contractions become progressively stronger and more regular regardless of maternal movement.</w:t>
       </w:r>
     </w:p>
     <w:p>
@@ -1721,7 +1553,7 @@
           <w:b/>
           <w:color w:val="102C57"/>
         </w:rPr>
-        <w:t>3. An EMT crew responds to a vehicle crash where a power line is draped across the hood of a car. The driver is conscious and shouting for help. What should the EMTs do?</w:t>
+        <w:t>Question 5: Resuscitation Priorities for a Pulseless, Apneic Patient at 37 Weeks Gestation</w:t>
         <w:br/>
       </w:r>
     </w:p>
@@ -1731,7 +1563,7 @@
         <w:ind w:left="360"/>
       </w:pPr>
       <w:r>
-        <w:t>A. Approach the car wearing turnout gear and open the door</w:t>
+        <w:t>A. Delivering sternal compressions lower than the standard position</w:t>
       </w:r>
     </w:p>
     <w:p>
@@ -1740,7 +1572,7 @@
         <w:ind w:left="360"/>
       </w:pPr>
       <w:r>
-        <w:t>B. Use a wooden broom handle to push the wire off the car</w:t>
+        <w:t>B. Withholding electrical defibrillation to protect fetal safety</w:t>
       </w:r>
     </w:p>
     <w:p>
@@ -1749,7 +1581,7 @@
         <w:ind w:left="360"/>
       </w:pPr>
       <w:r>
-        <w:t>C. Instruct the driver to stay inside the vehicle and remain clear until the electric utility de-energizes the line</w:t>
+        <w:t>C. Performing manual leftward displacement of the gravid uterus</w:t>
       </w:r>
     </w:p>
     <w:p>
@@ -1758,7 +1590,7 @@
         <w:ind w:left="360"/>
       </w:pPr>
       <w:r>
-        <w:t>D. Spray the car with water to extinguish sparks</w:t>
+        <w:t>D. Compressing at an elevated rate between 120 and 140 compressions per minute</w:t>
       </w:r>
     </w:p>
     <w:p>
@@ -1777,17 +1609,17 @@
         <w:rPr>
           <w:b/>
         </w:rPr>
-        <w:t>C. Instruct the driver to stay inside the vehicle and remain clear until the electric utility de-energizes the line</w:t>
+        <w:t>C. Performing manual leftward displacement of the gravid uterus</w:t>
         <w:br/>
       </w:r>
       <w:r>
         <w:rPr>
           <w:b/>
         </w:rPr>
-        <w:t xml:space="preserve">Rationale: </w:t>
+        <w:t xml:space="preserve">Clinical Rationale: </w:t>
       </w:r>
       <w:r>
-        <w:t>All downed power lines must be considered live and energized. As long as the occupants remain inside and the vehicle is not on fire, the rubber tires insulate them. Responders must establish a danger zone and wait for the power company.</w:t>
+        <w:t>In the late third trimester (≥ 20 weeks), the heavy gravid uterus compresses the inferior vena cava and abdominal aorta against the lumbar spine in the supine position (aortocaval compression), severely reducing venous return and rendering chest compressions hemodynamically ineffective. Resuscitation guidelines mandate continuous Manual Left Uterine Displacement (LUD) to relieve IVC compression during CPR. (Defibrillation is safe and must never be withheld; compressions remain at 100–120/min).</w:t>
       </w:r>
     </w:p>
     <w:p>
@@ -1799,7 +1631,7 @@
           <w:b/>
           <w:color w:val="102C57"/>
         </w:rPr>
-        <w:t>4. Which stage of the General Adaptation Syndrome is characterized by chronic physical and emotional breakdown, immune suppression, and exhaustion?</w:t>
+        <w:t>Question 6: Timing the Secondary Apgar Assessment for a Delivery Recorded at 7:52</w:t>
         <w:br/>
       </w:r>
     </w:p>
@@ -1809,7 +1641,7 @@
         <w:ind w:left="360"/>
       </w:pPr>
       <w:r>
-        <w:t>A. Stage of Resistance</w:t>
+        <w:t>A. 7:59</w:t>
       </w:r>
     </w:p>
     <w:p>
@@ -1818,7 +1650,7 @@
         <w:ind w:left="360"/>
       </w:pPr>
       <w:r>
-        <w:t>B. Alarm Reaction</w:t>
+        <w:t>B. 7:57</w:t>
       </w:r>
     </w:p>
     <w:p>
@@ -1827,7 +1659,7 @@
         <w:ind w:left="360"/>
       </w:pPr>
       <w:r>
-        <w:t>C. Stage of Exhaustion</w:t>
+        <w:t>C. 8:00</w:t>
       </w:r>
     </w:p>
     <w:p>
@@ -1836,7 +1668,7 @@
         <w:ind w:left="360"/>
       </w:pPr>
       <w:r>
-        <w:t>D. Stage of Denial</w:t>
+        <w:t>D. 7:53</w:t>
       </w:r>
     </w:p>
     <w:p>
@@ -1855,17 +1687,17 @@
         <w:rPr>
           <w:b/>
         </w:rPr>
-        <w:t>C. Stage of Exhaustion</w:t>
+        <w:t>B. 7:57</w:t>
         <w:br/>
       </w:r>
       <w:r>
         <w:rPr>
           <w:b/>
         </w:rPr>
-        <w:t xml:space="preserve">Rationale: </w:t>
+        <w:t xml:space="preserve">Clinical Rationale: </w:t>
       </w:r>
       <w:r>
-        <w:t>Selye's GAS model describes the Stage of Exhaustion as the prolonged, unmitigated exposure to stress where physical and psychological adaptive reserves are completely depleted.</w:t>
+        <w:t>Apgar scores are calculated at 1 minute and 5 minutes postpartum. With birth recorded at 07:52, the initial assessment occurs at 07:53, and the secondary assessment occurs at 07:57 (07:52 + 5 minutes).</w:t>
       </w:r>
     </w:p>
     <w:p>
@@ -1877,7 +1709,7 @@
           <w:b/>
           <w:color w:val="102C57"/>
         </w:rPr>
-        <w:t>5. When breaking the news of a patient's sudden death to a grieving family member, the EMT should use which phrase?</w:t>
+        <w:t>Question 7: Strict Prehospital Indications for Manual Vaginal Insertion During Childbirth</w:t>
         <w:br/>
       </w:r>
     </w:p>
@@ -1887,7 +1719,7 @@
         <w:ind w:left="360"/>
       </w:pPr>
       <w:r>
-        <w:t>A. 'He has passed away to a peaceful place.'</w:t>
+        <w:t>A. Cephalic vertex presentation and stage-three placental delivery</w:t>
       </w:r>
     </w:p>
     <w:p>
@@ -1896,7 +1728,7 @@
         <w:ind w:left="360"/>
       </w:pPr>
       <w:r>
-        <w:t>B. 'I am deeply sorry, but your husband has died.'</w:t>
+        <w:t>B. Nuchal cord entanglement and single-extremity presentation</w:t>
       </w:r>
     </w:p>
     <w:p>
@@ -1905,7 +1737,7 @@
         <w:ind w:left="360"/>
       </w:pPr>
       <w:r>
-        <w:t>C. 'We lost him on the way here.'</w:t>
+        <w:t>C. Isolated extremity presentation with significant hemorrhage</w:t>
       </w:r>
     </w:p>
     <w:p>
@@ -1914,7 +1746,7 @@
         <w:ind w:left="360"/>
       </w:pPr>
       <w:r>
-        <w:t>D. 'Everything happens for a reason.'</w:t>
+        <w:t>D. Breech presentation with delayed head delivery and umbilical cord prolapse</w:t>
       </w:r>
     </w:p>
     <w:p>
@@ -1933,17 +1765,17 @@
         <w:rPr>
           <w:b/>
         </w:rPr>
-        <w:t>B. 'I am deeply sorry, but your husband has died.'</w:t>
+        <w:t>D. Breech presentation with delayed head delivery and umbilical cord prolapse</w:t>
         <w:br/>
       </w:r>
       <w:r>
         <w:rPr>
           <w:b/>
         </w:rPr>
-        <w:t xml:space="preserve">Rationale: </w:t>
+        <w:t xml:space="preserve">Clinical Rationale: </w:t>
       </w:r>
       <w:r>
-        <w:t>Clear, compassionate, direct language using the words 'dead' or 'died' prevents ambiguity and denial. Euphemisms like 'passed on' or 'lost' cause false hope and confusion.</w:t>
+        <w:t>Prehospital manual insertion of a sterile gloved hand/fingers into the vagina is strictly restricted to only two life-threatening emergencies: (1) Prolapsed Umbilical Cord (pushing the presenting fetal part up and off the pulsating cord to maintain fetal perfusion), and (2) Breech Delivery with Head Entrapment (&gt; 3 minutes) (forming a 'V' with gloved fingers along the infant's face to push the vaginal wall away from the nose and mouth, creating a continuous patent airway).</w:t>
       </w:r>
     </w:p>
     <w:p>
@@ -1955,7 +1787,7 @@
           <w:b/>
           <w:color w:val="102C57"/>
         </w:rPr>
-        <w:t>6. In the Crew Resource Management (CRM) PACE advocacy mnemonic, what does the letter 'A' represent?</w:t>
+        <w:t>Question 8: Immediate Initial Intervention When a Nuchal Cord is Identified</w:t>
         <w:br/>
       </w:r>
     </w:p>
@@ -1965,7 +1797,7 @@
         <w:ind w:left="360"/>
       </w:pPr>
       <w:r>
-        <w:t>A. Action</w:t>
+        <w:t>A. Administering high-flow oxygen to the mother and initiating rapid transport</w:t>
       </w:r>
     </w:p>
     <w:p>
@@ -1974,7 +1806,7 @@
         <w:ind w:left="360"/>
       </w:pPr>
       <w:r>
-        <w:t>B. Alert</w:t>
+        <w:t>B. Providing blow-by oxygen across the newborn's face and transporting</w:t>
       </w:r>
     </w:p>
     <w:p>
@@ -1983,7 +1815,7 @@
         <w:ind w:left="360"/>
       </w:pPr>
       <w:r>
-        <w:t>C. Abandon</w:t>
+        <w:t>C. Attempting gentle reduction of the loop over the newborn's cranium</w:t>
       </w:r>
     </w:p>
     <w:p>
@@ -1992,7 +1824,7 @@
         <w:ind w:left="360"/>
       </w:pPr>
       <w:r>
-        <w:t>D. Assessment</w:t>
+        <w:t>D. Promptly clamping and dividing the cord in place</w:t>
       </w:r>
     </w:p>
     <w:p>
@@ -2011,17 +1843,17 @@
         <w:rPr>
           <w:b/>
         </w:rPr>
-        <w:t>B. Alert</w:t>
+        <w:t>C. Attempting gentle reduction of the loop over the newborn's cranium</w:t>
         <w:br/>
       </w:r>
       <w:r>
         <w:rPr>
           <w:b/>
         </w:rPr>
-        <w:t xml:space="preserve">Rationale: </w:t>
+        <w:t xml:space="preserve">Clinical Rationale: </w:t>
       </w:r>
       <w:r>
-        <w:t>PACE stands for Probe, Alert, Challenge, and Emergency. It provides a standardized escalation gradient for team members to challenge an unsafe clinical decision.</w:t>
+        <w:t>As soon as the infant's head delivers, the EMT must palpate the neck for a nuchal cord. The immediate first-line action is to gently slip (reduce) the cord loop over the infant's head with a finger. Only if the cord is too tight to slip or remove over the shoulders do you clamp twice (2 inches apart) and cut between the clamps.</w:t>
       </w:r>
     </w:p>
     <w:p>
@@ -2033,7 +1865,7 @@
           <w:b/>
           <w:color w:val="102C57"/>
         </w:rPr>
-        <w:t>7. What is the gold-standard method for continuously verifying and monitoring proper endotracheal tube placement in the field?</w:t>
+        <w:t>Question 9: Assessment Priority Before Administering Nitroglycerin to an ACS Patient Prescribed Vasotec, Nitrostat, and Viagra</w:t>
         <w:br/>
       </w:r>
     </w:p>
@@ -2043,7 +1875,7 @@
         <w:ind w:left="360"/>
       </w:pPr>
       <w:r>
-        <w:t>A. Looking for mist inside the tube</w:t>
+        <w:t>A. Placing the patient completely supine and initiating transport</w:t>
       </w:r>
     </w:p>
     <w:p>
@@ -2052,7 +1884,7 @@
         <w:ind w:left="360"/>
       </w:pPr>
       <w:r>
-        <w:t>B. Pulse oximetry reading above 95%</w:t>
+        <w:t>B. Delivering an initial sublingual dose before establishing medical contact</w:t>
       </w:r>
     </w:p>
     <w:p>
@@ -2061,7 +1893,7 @@
         <w:ind w:left="360"/>
       </w:pPr>
       <w:r>
-        <w:t>C. Continuous waveform capnography (ETCO2)</w:t>
+        <w:t>C. Requesting physician authorization prior to drug delivery</w:t>
       </w:r>
     </w:p>
     <w:p>
@@ -2070,7 +1902,7 @@
         <w:ind w:left="360"/>
       </w:pPr>
       <w:r>
-        <w:t>D. Assessing skin color of the patient's face</w:t>
+        <w:t>D. Determining whether a PDE-5 inhibitor was ingested during the preceding 24 hours</w:t>
       </w:r>
     </w:p>
     <w:p>
@@ -2089,17 +1921,17 @@
         <w:rPr>
           <w:b/>
         </w:rPr>
-        <w:t>C. Continuous waveform capnography (ETCO2)</w:t>
+        <w:t>D. Determining whether a PDE-5 inhibitor was ingested during the preceding 24 hours</w:t>
         <w:br/>
       </w:r>
       <w:r>
         <w:rPr>
           <w:b/>
         </w:rPr>
-        <w:t xml:space="preserve">Rationale: </w:t>
+        <w:t xml:space="preserve">Clinical Rationale: </w:t>
       </w:r>
       <w:r>
-        <w:t>Waveform capnography provides instantaneous, continuous verification of tracheal placement (rectangular waveform with ETCO2 35–45 mmHg). Mist and pulse oximetry are unreliable.</w:t>
+        <w:t>Phosphodiesterase-5 (PDE-5) inhibitors (e.g., sildenafil / Viagra, vardenafil / Levitra within 24 hours; tadalafil / Cialis within 48 hours) taken concurrently with nitrates trigger profound, irreversible, and potentially fatal systemic vasodilation and hypotension. Screening for the exact timing of PDE-5 ingestion is a mandatory pre-administration assessment priority.</w:t>
       </w:r>
     </w:p>
     <w:p>
@@ -2111,7 +1943,7 @@
           <w:b/>
           <w:color w:val="102C57"/>
         </w:rPr>
-        <w:t>8. During an emergency department handoff, an EMT is giving a report while the nurse is answering a phone call and looking away. Which element of effective handover is being violated?</w:t>
+        <w:t>Question 10: Generic Classification Corresponding to Brand Formulations Nuprin, Motrin, and Advil</w:t>
         <w:br/>
       </w:r>
     </w:p>
@@ -2121,7 +1953,7 @@
         <w:ind w:left="360"/>
       </w:pPr>
       <w:r>
-        <w:t>A. Closed-loop communication</w:t>
+        <w:t>A. Ibuprofen</w:t>
       </w:r>
     </w:p>
     <w:p>
@@ -2130,7 +1962,7 @@
         <w:ind w:left="360"/>
       </w:pPr>
       <w:r>
-        <w:t>B. Minimal distractions and respectful, focused interaction</w:t>
+        <w:t>B. Aspirin</w:t>
       </w:r>
     </w:p>
     <w:p>
@@ -2139,7 +1971,7 @@
         <w:ind w:left="360"/>
       </w:pPr>
       <w:r>
-        <w:t>C. SBAR recommendation step</w:t>
+        <w:t>C. Nitrostat</w:t>
       </w:r>
     </w:p>
     <w:p>
@@ -2148,7 +1980,7 @@
         <w:ind w:left="360"/>
       </w:pPr>
       <w:r>
-        <w:t>D. Medical direction approval</w:t>
+        <w:t>D. Acetaminophen</w:t>
       </w:r>
     </w:p>
     <w:p>
@@ -2167,17 +1999,17 @@
         <w:rPr>
           <w:b/>
         </w:rPr>
-        <w:t>B. Minimal distractions and respectful, focused interaction</w:t>
+        <w:t>A. Ibuprofen</w:t>
         <w:br/>
       </w:r>
       <w:r>
         <w:rPr>
           <w:b/>
         </w:rPr>
-        <w:t xml:space="preserve">Rationale: </w:t>
+        <w:t xml:space="preserve">Clinical Rationale: </w:t>
       </w:r>
       <w:r>
-        <w:t>Transfer of care requires mutual engagement with minimal distractions to prevent critical omissions in patient history or medication errors.</w:t>
+        <w:t>Advil, Motrin, and Nuprin are trade (brand) names for the generic nonsteroidal anti-inflammatory drug (NSAID) ibuprofen. Acetaminophen is Tylenol; aspirin is acetylsalicylic acid (Bayer); Nitrostat is nitroglycerin.</w:t>
       </w:r>
     </w:p>
     <w:p>
@@ -2189,7 +2021,7 @@
           <w:b/>
           <w:color w:val="102C57"/>
         </w:rPr>
-        <w:t>9. An EMT ignores a patient's unilateral leg swelling and tachypnea because the dispatch note said 'anxiety attack.' This is a classic example of which cognitive bias?</w:t>
+        <w:t>Question 12: Clinical Considerations When Administering Naloxone for Unresponsive Opioid Toxicity</w:t>
         <w:br/>
       </w:r>
     </w:p>
@@ -2199,7 +2031,7 @@
         <w:ind w:left="360"/>
       </w:pPr>
       <w:r>
-        <w:t>A. Confirmation and Anchoring bias</w:t>
+        <w:t>A. Delivering the medication in mandatory 2 mg increments</w:t>
       </w:r>
     </w:p>
     <w:p>
@@ -2208,7 +2040,7 @@
         <w:ind w:left="360"/>
       </w:pPr>
       <w:r>
-        <w:t>B. Overconfidence bias</w:t>
+        <w:t>B. Half-life of naloxone exceeding the duration of active opioids</w:t>
       </w:r>
     </w:p>
     <w:p>
@@ -2217,7 +2049,7 @@
         <w:ind w:left="360"/>
       </w:pPr>
       <w:r>
-        <w:t>C. Blind obedience to authority</w:t>
+        <w:t>C. Withholding the antagonist in the presence of hypoventilation</w:t>
       </w:r>
     </w:p>
     <w:p>
@@ -2226,7 +2058,7 @@
         <w:ind w:left="360"/>
       </w:pPr>
       <w:r>
-        <w:t>D. Gambler's fallacy</w:t>
+        <w:t>D. Precipitating acute withdrawal seizures in chronically dependent patients</w:t>
       </w:r>
     </w:p>
     <w:p>
@@ -2245,17 +2077,17 @@
         <w:rPr>
           <w:b/>
         </w:rPr>
-        <w:t>A. Confirmation and Anchoring bias</w:t>
+        <w:t>D. Precipitating acute withdrawal seizures in chronically dependent patients</w:t>
         <w:br/>
       </w:r>
       <w:r>
         <w:rPr>
           <w:b/>
         </w:rPr>
-        <w:t xml:space="preserve">Rationale: </w:t>
+        <w:t xml:space="preserve">Clinical Rationale: </w:t>
       </w:r>
       <w:r>
-        <w:t>Anchoring bias fixates on initial information (dispatch text); confirmation bias actively looks for anxiety clues while dismissing physical signs of a pulmonary embolism.</w:t>
+        <w:t>Naloxone is a competitive mu-opioid receptor antagonist. Rapid administration in a patient with chronic physical opioid dependence can precipitate immediate, acute opioid withdrawal syndrome—causing vomiting, agitation, severe sympathetic surge, and in vulnerable patients or neonates, withdrawal seizures. (Option B is incorrect because naloxone's half-life of 30–90 minutes is shorter than most active opioids, which can cause recurrent respiratory arrest).</w:t>
       </w:r>
     </w:p>
     <w:p>
@@ -2267,7 +2099,7 @@
           <w:b/>
           <w:color w:val="102C57"/>
         </w:rPr>
-        <w:t>10. An EMT assists a paramedic with an IV line. Shortly after starting the infusion, the patient complains of burning, and the skin around the catheter becomes cool, pale, and swollen. What has occurred?</w:t>
+        <w:t>Question 13: Management of an Alert Patient Experiencing Symptomatic Hypotension Post-Nitroglycerin</w:t>
         <w:br/>
       </w:r>
     </w:p>
@@ -2277,7 +2109,7 @@
         <w:ind w:left="360"/>
       </w:pPr>
       <w:r>
-        <w:t>A. Phlebitis</w:t>
+        <w:t>A. Initiating positive-pressure ventilations via bag-valve mask</w:t>
       </w:r>
     </w:p>
     <w:p>
@@ -2286,7 +2118,7 @@
         <w:ind w:left="360"/>
       </w:pPr>
       <w:r>
-        <w:t>B. Infiltration / Extravasation</w:t>
+        <w:t>B. Waiting five minutes before repeating vital signs</w:t>
       </w:r>
     </w:p>
     <w:p>
@@ -2295,7 +2127,7 @@
         <w:ind w:left="360"/>
       </w:pPr>
       <w:r>
-        <w:t>C. Arterial puncture</w:t>
+        <w:t>C. Positioning the patient supine on the stretcher</w:t>
       </w:r>
     </w:p>
     <w:p>
@@ -2304,7 +2136,7 @@
         <w:ind w:left="360"/>
       </w:pPr>
       <w:r>
-        <w:t>D. Air embolism</w:t>
+        <w:t>D. Maintaining an upright seated transport posture</w:t>
       </w:r>
     </w:p>
     <w:p>
@@ -2323,19 +2155,781 @@
         <w:rPr>
           <w:b/>
         </w:rPr>
-        <w:t>B. Infiltration / Extravasation</w:t>
+        <w:t>C. Positioning the patient supine on the stretcher</w:t>
         <w:br/>
       </w:r>
       <w:r>
         <w:rPr>
           <w:b/>
         </w:rPr>
-        <w:t xml:space="preserve">Rationale: </w:t>
+        <w:t xml:space="preserve">Clinical Rationale: </w:t>
       </w:r>
       <w:r>
-        <w:t>Infiltration occurs when the IV catheter slips out of the vein into the interstitial tissue. Infusing fluid accumulates, creating a cool, pale, swollen, and painful lump. The line must be clamped immediately.</w:t>
+        <w:t>Nitroglycerin relaxes vascular smooth muscle, causing profound venous dilation and peripheral blood pooling. When a patient develops symptomatic hypotension, placing them in the supine position (or elevating the lower extremities) utilizes gravity to augment venous return to the right atrium, increasing preload, cardiac output, and cerebral perfusion.</w:t>
       </w:r>
     </w:p>
+    <w:p>
+      <w:pPr>
+        <w:spacing w:before="80" w:after="40"/>
+      </w:pPr>
+      <w:r>
+        <w:rPr>
+          <w:b/>
+          <w:color w:val="102C57"/>
+        </w:rPr>
+        <w:t>Question 15: Identification of a Rules-Based Medication Administration Error</w:t>
+        <w:br/>
+      </w:r>
+    </w:p>
+    <w:p>
+      <w:pPr>
+        <w:spacing w:before="20" w:after="20"/>
+        <w:ind w:left="360"/>
+      </w:pPr>
+      <w:r>
+        <w:t>A. Delivering a medication despite the presence of clinical contraindications</w:t>
+      </w:r>
+    </w:p>
+    <w:p>
+      <w:pPr>
+        <w:spacing w:before="20" w:after="20"/>
+        <w:ind w:left="360"/>
+      </w:pPr>
+      <w:r>
+        <w:t>B. Administering a drug that falls outside medical director authorization or protocols</w:t>
+      </w:r>
+    </w:p>
+    <w:p>
+      <w:pPr>
+        <w:spacing w:before="20" w:after="20"/>
+        <w:ind w:left="360"/>
+      </w:pPr>
+      <w:r>
+        <w:t>C. Inadvertently preparing and giving a dose higher than the intended order</w:t>
+      </w:r>
+    </w:p>
+    <w:p>
+      <w:pPr>
+        <w:spacing w:before="20" w:after="20"/>
+        <w:ind w:left="360"/>
+      </w:pPr>
+      <w:r>
+        <w:t>D. Selecting the proper agent but delivering it via the incorrect administration route</w:t>
+      </w:r>
+    </w:p>
+    <w:p>
+      <w:pPr>
+        <w:spacing w:before="40" w:after="120"/>
+        <w:ind w:left="360"/>
+      </w:pPr>
+      <w:r>
+        <w:rPr>
+          <w:b/>
+          <w:color w:val="BA181B"/>
+        </w:rPr>
+        <w:t xml:space="preserve">Correct Answer: </w:t>
+      </w:r>
+      <w:r>
+        <w:rPr>
+          <w:b/>
+        </w:rPr>
+        <w:t>B. Administering a drug that falls outside medical director authorization or protocols</w:t>
+        <w:br/>
+      </w:r>
+      <w:r>
+        <w:rPr>
+          <w:b/>
+        </w:rPr>
+        <w:t xml:space="preserve">Clinical Rationale: </w:t>
+      </w:r>
+      <w:r>
+        <w:t>In the EMS human error taxonomy: (1) Rules-Based Error: Performing an action that violates established protocols, administrative rules, scope of practice, or medical director standing orders (Option B). (2) Knowledge-Based Error: Choosing the wrong drug due to poor understanding of pharmacology, pathology, or contraindications (Option A). (3) Skills-Based Error: Mechanical or procedural slip during execution, such as improper administration technique or incorrect route execution (Option D).</w:t>
+      </w:r>
+    </w:p>
+    <w:p>
+      <w:r>
+        <w:br w:type="page"/>
+      </w:r>
+    </w:p>
+    <w:p>
+      <w:pPr>
+        <w:pStyle w:val="Heading1"/>
+        <w:spacing w:before="240" w:after="80"/>
+      </w:pPr>
+      <w:r>
+        <w:t>MODULE 4: HIGH-YIELD REFERENCE MATRICES</w:t>
+      </w:r>
+    </w:p>
+    <w:p>
+      <w:pPr>
+        <w:pStyle w:val="Heading2"/>
+        <w:spacing w:before="120" w:after="80"/>
+      </w:pPr>
+      <w:r>
+        <w:t>1. CRM PACE Mnemonic for Assertive Advocacy</w:t>
+      </w:r>
+    </w:p>
+    <w:tbl>
+      <w:tblPr>
+        <w:tblW w:type="auto" w:w="0"/>
+        <w:jc w:val="center"/>
+        <w:tblLayout w:type="fixed"/>
+        <w:tblLook w:firstColumn="1" w:firstRow="1" w:lastColumn="0" w:lastRow="0" w:noHBand="0" w:noVBand="1" w:val="04A0"/>
+      </w:tblPr>
+      <w:tblGrid>
+        <w:gridCol w:w="3360"/>
+        <w:gridCol w:w="3360"/>
+        <w:gridCol w:w="3360"/>
+      </w:tblGrid>
+      <w:tr>
+        <w:tc>
+          <w:tcPr>
+            <w:tcW w:type="dxa" w:w="1728"/>
+            <w:shd w:fill="102C57"/>
+            <w:tcMar>
+              <w:top w:w="80" w:type="dxa"/>
+              <w:bottom w:w="80" w:type="dxa"/>
+              <w:left w:w="100" w:type="dxa"/>
+              <w:right w:w="100" w:type="dxa"/>
+            </w:tcMar>
+          </w:tcPr>
+          <w:p>
+            <w:r>
+              <w:rPr>
+                <w:b/>
+                <w:color w:val="FFFFFF"/>
+                <w:sz w:val="19"/>
+              </w:rPr>
+              <w:t>PACE Step</w:t>
+            </w:r>
+          </w:p>
+        </w:tc>
+        <w:tc>
+          <w:tcPr>
+            <w:tcW w:type="dxa" w:w="3312"/>
+            <w:shd w:fill="102C57"/>
+            <w:tcMar>
+              <w:top w:w="80" w:type="dxa"/>
+              <w:bottom w:w="80" w:type="dxa"/>
+              <w:left w:w="100" w:type="dxa"/>
+              <w:right w:w="100" w:type="dxa"/>
+            </w:tcMar>
+          </w:tcPr>
+          <w:p>
+            <w:r>
+              <w:rPr>
+                <w:b/>
+                <w:color w:val="FFFFFF"/>
+                <w:sz w:val="19"/>
+              </w:rPr>
+              <w:t>Clinical Objective</w:t>
+            </w:r>
+          </w:p>
+        </w:tc>
+        <w:tc>
+          <w:tcPr>
+            <w:tcW w:type="dxa" w:w="5040"/>
+            <w:shd w:fill="102C57"/>
+            <w:tcMar>
+              <w:top w:w="80" w:type="dxa"/>
+              <w:bottom w:w="80" w:type="dxa"/>
+              <w:left w:w="100" w:type="dxa"/>
+              <w:right w:w="100" w:type="dxa"/>
+            </w:tcMar>
+          </w:tcPr>
+          <w:p>
+            <w:r>
+              <w:rPr>
+                <w:b/>
+                <w:color w:val="FFFFFF"/>
+                <w:sz w:val="19"/>
+              </w:rPr>
+              <w:t>Standard Verbal Script</w:t>
+            </w:r>
+          </w:p>
+        </w:tc>
+      </w:tr>
+      <w:tr>
+        <w:tc>
+          <w:tcPr>
+            <w:tcW w:type="dxa" w:w="1728"/>
+            <w:tcMar>
+              <w:top w:w="60" w:type="dxa"/>
+              <w:bottom w:w="60" w:type="dxa"/>
+              <w:left w:w="80" w:type="dxa"/>
+              <w:right w:w="80" w:type="dxa"/>
+            </w:tcMar>
+          </w:tcPr>
+          <w:p>
+            <w:pPr>
+              <w:spacing w:before="0" w:after="0"/>
+            </w:pPr>
+            <w:r>
+              <w:rPr>
+                <w:sz w:val="18"/>
+              </w:rPr>
+              <w:t>P — Probe</w:t>
+            </w:r>
+          </w:p>
+        </w:tc>
+        <w:tc>
+          <w:tcPr>
+            <w:tcW w:type="dxa" w:w="3312"/>
+            <w:tcMar>
+              <w:top w:w="60" w:type="dxa"/>
+              <w:bottom w:w="60" w:type="dxa"/>
+              <w:left w:w="80" w:type="dxa"/>
+              <w:right w:w="80" w:type="dxa"/>
+            </w:tcMar>
+          </w:tcPr>
+          <w:p>
+            <w:pPr>
+              <w:spacing w:before="0" w:after="0"/>
+            </w:pPr>
+            <w:r>
+              <w:rPr>
+                <w:sz w:val="18"/>
+              </w:rPr>
+              <w:t>Inquire gently to confirm situational awareness</w:t>
+            </w:r>
+          </w:p>
+        </w:tc>
+        <w:tc>
+          <w:tcPr>
+            <w:tcW w:type="dxa" w:w="5040"/>
+            <w:tcMar>
+              <w:top w:w="60" w:type="dxa"/>
+              <w:bottom w:w="60" w:type="dxa"/>
+              <w:left w:w="80" w:type="dxa"/>
+              <w:right w:w="80" w:type="dxa"/>
+            </w:tcMar>
+          </w:tcPr>
+          <w:p>
+            <w:pPr>
+              <w:spacing w:before="0" w:after="0"/>
+            </w:pPr>
+            <w:r>
+              <w:rPr>
+                <w:sz w:val="18"/>
+              </w:rPr>
+              <w:t>'Do you see the patient's oxygen saturation reading?'</w:t>
+            </w:r>
+          </w:p>
+        </w:tc>
+      </w:tr>
+      <w:tr>
+        <w:tc>
+          <w:tcPr>
+            <w:tcW w:type="dxa" w:w="1728"/>
+            <w:shd w:fill="F2F5F9"/>
+            <w:tcMar>
+              <w:top w:w="60" w:type="dxa"/>
+              <w:bottom w:w="60" w:type="dxa"/>
+              <w:left w:w="80" w:type="dxa"/>
+              <w:right w:w="80" w:type="dxa"/>
+            </w:tcMar>
+          </w:tcPr>
+          <w:p>
+            <w:pPr>
+              <w:spacing w:before="0" w:after="0"/>
+            </w:pPr>
+            <w:r>
+              <w:rPr>
+                <w:sz w:val="18"/>
+              </w:rPr>
+              <w:t>A — Alert</w:t>
+            </w:r>
+          </w:p>
+        </w:tc>
+        <w:tc>
+          <w:tcPr>
+            <w:tcW w:type="dxa" w:w="3312"/>
+            <w:shd w:fill="F2F5F9"/>
+            <w:tcMar>
+              <w:top w:w="60" w:type="dxa"/>
+              <w:bottom w:w="60" w:type="dxa"/>
+              <w:left w:w="80" w:type="dxa"/>
+              <w:right w:w="80" w:type="dxa"/>
+            </w:tcMar>
+          </w:tcPr>
+          <w:p>
+            <w:pPr>
+              <w:spacing w:before="0" w:after="0"/>
+            </w:pPr>
+            <w:r>
+              <w:rPr>
+                <w:sz w:val="18"/>
+              </w:rPr>
+              <w:t>State the objective clinical finding unambiguously</w:t>
+            </w:r>
+          </w:p>
+        </w:tc>
+        <w:tc>
+          <w:tcPr>
+            <w:tcW w:type="dxa" w:w="5040"/>
+            <w:shd w:fill="F2F5F9"/>
+            <w:tcMar>
+              <w:top w:w="60" w:type="dxa"/>
+              <w:bottom w:w="60" w:type="dxa"/>
+              <w:left w:w="80" w:type="dxa"/>
+              <w:right w:w="80" w:type="dxa"/>
+            </w:tcMar>
+          </w:tcPr>
+          <w:p>
+            <w:pPr>
+              <w:spacing w:before="0" w:after="0"/>
+            </w:pPr>
+            <w:r>
+              <w:rPr>
+                <w:sz w:val="18"/>
+              </w:rPr>
+              <w:t>'The SpO2 is dropping rapidly and is currently at 82%.'</w:t>
+            </w:r>
+          </w:p>
+        </w:tc>
+      </w:tr>
+      <w:tr>
+        <w:tc>
+          <w:tcPr>
+            <w:tcW w:type="dxa" w:w="1728"/>
+            <w:tcMar>
+              <w:top w:w="60" w:type="dxa"/>
+              <w:bottom w:w="60" w:type="dxa"/>
+              <w:left w:w="80" w:type="dxa"/>
+              <w:right w:w="80" w:type="dxa"/>
+            </w:tcMar>
+          </w:tcPr>
+          <w:p>
+            <w:pPr>
+              <w:spacing w:before="0" w:after="0"/>
+            </w:pPr>
+            <w:r>
+              <w:rPr>
+                <w:sz w:val="18"/>
+              </w:rPr>
+              <w:t>C — Challenge</w:t>
+            </w:r>
+          </w:p>
+        </w:tc>
+        <w:tc>
+          <w:tcPr>
+            <w:tcW w:type="dxa" w:w="3312"/>
+            <w:tcMar>
+              <w:top w:w="60" w:type="dxa"/>
+              <w:bottom w:w="60" w:type="dxa"/>
+              <w:left w:w="80" w:type="dxa"/>
+              <w:right w:w="80" w:type="dxa"/>
+            </w:tcMar>
+          </w:tcPr>
+          <w:p>
+            <w:pPr>
+              <w:spacing w:before="0" w:after="0"/>
+            </w:pPr>
+            <w:r>
+              <w:rPr>
+                <w:sz w:val="18"/>
+              </w:rPr>
+              <w:t>Directly confront the action and propose safe solution</w:t>
+            </w:r>
+          </w:p>
+        </w:tc>
+        <w:tc>
+          <w:tcPr>
+            <w:tcW w:type="dxa" w:w="5040"/>
+            <w:tcMar>
+              <w:top w:w="60" w:type="dxa"/>
+              <w:bottom w:w="60" w:type="dxa"/>
+              <w:left w:w="80" w:type="dxa"/>
+              <w:right w:w="80" w:type="dxa"/>
+            </w:tcMar>
+          </w:tcPr>
+          <w:p>
+            <w:pPr>
+              <w:spacing w:before="0" w:after="0"/>
+            </w:pPr>
+            <w:r>
+              <w:rPr>
+                <w:sz w:val="18"/>
+              </w:rPr>
+              <w:t>'We need to stop the intubation attempt and bag the patient immediately.'</w:t>
+            </w:r>
+          </w:p>
+        </w:tc>
+      </w:tr>
+      <w:tr>
+        <w:tc>
+          <w:tcPr>
+            <w:tcW w:type="dxa" w:w="1728"/>
+            <w:shd w:fill="F2F5F9"/>
+            <w:tcMar>
+              <w:top w:w="60" w:type="dxa"/>
+              <w:bottom w:w="60" w:type="dxa"/>
+              <w:left w:w="80" w:type="dxa"/>
+              <w:right w:w="80" w:type="dxa"/>
+            </w:tcMar>
+          </w:tcPr>
+          <w:p>
+            <w:pPr>
+              <w:spacing w:before="0" w:after="0"/>
+            </w:pPr>
+            <w:r>
+              <w:rPr>
+                <w:sz w:val="18"/>
+              </w:rPr>
+              <w:t>E — Emergency</w:t>
+            </w:r>
+          </w:p>
+        </w:tc>
+        <w:tc>
+          <w:tcPr>
+            <w:tcW w:type="dxa" w:w="3312"/>
+            <w:shd w:fill="F2F5F9"/>
+            <w:tcMar>
+              <w:top w:w="60" w:type="dxa"/>
+              <w:bottom w:w="60" w:type="dxa"/>
+              <w:left w:w="80" w:type="dxa"/>
+              <w:right w:w="80" w:type="dxa"/>
+            </w:tcMar>
+          </w:tcPr>
+          <w:p>
+            <w:pPr>
+              <w:spacing w:before="0" w:after="0"/>
+            </w:pPr>
+            <w:r>
+              <w:rPr>
+                <w:sz w:val="18"/>
+              </w:rPr>
+              <w:t>Direct, unequivocal intervention to halt patient harm</w:t>
+            </w:r>
+          </w:p>
+        </w:tc>
+        <w:tc>
+          <w:tcPr>
+            <w:tcW w:type="dxa" w:w="5040"/>
+            <w:shd w:fill="F2F5F9"/>
+            <w:tcMar>
+              <w:top w:w="60" w:type="dxa"/>
+              <w:bottom w:w="60" w:type="dxa"/>
+              <w:left w:w="80" w:type="dxa"/>
+              <w:right w:w="80" w:type="dxa"/>
+            </w:tcMar>
+          </w:tcPr>
+          <w:p>
+            <w:pPr>
+              <w:spacing w:before="0" w:after="0"/>
+            </w:pPr>
+            <w:r>
+              <w:rPr>
+                <w:sz w:val="18"/>
+              </w:rPr>
+              <w:t>'Stop! Stand down, I am taking the airway to ventilate now!'</w:t>
+            </w:r>
+          </w:p>
+        </w:tc>
+      </w:tr>
+    </w:tbl>
+    <w:p>
+      <w:pPr>
+        <w:spacing w:after="200"/>
+      </w:pPr>
+    </w:p>
+    <w:p>
+      <w:pPr>
+        <w:pStyle w:val="Heading2"/>
+        <w:spacing w:before="120" w:after="80"/>
+      </w:pPr>
+      <w:r>
+        <w:t>2. EMS Medical Error Taxonomy</w:t>
+      </w:r>
+    </w:p>
+    <w:tbl>
+      <w:tblPr>
+        <w:tblW w:type="auto" w:w="0"/>
+        <w:jc w:val="center"/>
+        <w:tblLayout w:type="fixed"/>
+        <w:tblLook w:firstColumn="1" w:firstRow="1" w:lastColumn="0" w:lastRow="0" w:noHBand="0" w:noVBand="1" w:val="04A0"/>
+      </w:tblPr>
+      <w:tblGrid>
+        <w:gridCol w:w="3360"/>
+        <w:gridCol w:w="3360"/>
+        <w:gridCol w:w="3360"/>
+      </w:tblGrid>
+      <w:tr>
+        <w:tc>
+          <w:tcPr>
+            <w:tcW w:type="dxa" w:w="2592"/>
+            <w:shd w:fill="BA181B"/>
+            <w:tcMar>
+              <w:top w:w="80" w:type="dxa"/>
+              <w:bottom w:w="80" w:type="dxa"/>
+              <w:left w:w="100" w:type="dxa"/>
+              <w:right w:w="100" w:type="dxa"/>
+            </w:tcMar>
+          </w:tcPr>
+          <w:p>
+            <w:r>
+              <w:rPr>
+                <w:b/>
+                <w:color w:val="FFFFFF"/>
+                <w:sz w:val="19"/>
+              </w:rPr>
+              <w:t>Error Type</w:t>
+            </w:r>
+          </w:p>
+        </w:tc>
+        <w:tc>
+          <w:tcPr>
+            <w:tcW w:type="dxa" w:w="3168"/>
+            <w:shd w:fill="BA181B"/>
+            <w:tcMar>
+              <w:top w:w="80" w:type="dxa"/>
+              <w:bottom w:w="80" w:type="dxa"/>
+              <w:left w:w="100" w:type="dxa"/>
+              <w:right w:w="100" w:type="dxa"/>
+            </w:tcMar>
+          </w:tcPr>
+          <w:p>
+            <w:r>
+              <w:rPr>
+                <w:b/>
+                <w:color w:val="FFFFFF"/>
+                <w:sz w:val="19"/>
+              </w:rPr>
+              <w:t>Core Mechanism</w:t>
+            </w:r>
+          </w:p>
+        </w:tc>
+        <w:tc>
+          <w:tcPr>
+            <w:tcW w:type="dxa" w:w="4320"/>
+            <w:shd w:fill="BA181B"/>
+            <w:tcMar>
+              <w:top w:w="80" w:type="dxa"/>
+              <w:bottom w:w="80" w:type="dxa"/>
+              <w:left w:w="100" w:type="dxa"/>
+              <w:right w:w="100" w:type="dxa"/>
+            </w:tcMar>
+          </w:tcPr>
+          <w:p>
+            <w:r>
+              <w:rPr>
+                <w:b/>
+                <w:color w:val="FFFFFF"/>
+                <w:sz w:val="19"/>
+              </w:rPr>
+              <w:t>Clinical Field Example</w:t>
+            </w:r>
+          </w:p>
+        </w:tc>
+      </w:tr>
+      <w:tr>
+        <w:tc>
+          <w:tcPr>
+            <w:tcW w:type="dxa" w:w="2592"/>
+            <w:tcMar>
+              <w:top w:w="60" w:type="dxa"/>
+              <w:bottom w:w="60" w:type="dxa"/>
+              <w:left w:w="80" w:type="dxa"/>
+              <w:right w:w="80" w:type="dxa"/>
+            </w:tcMar>
+          </w:tcPr>
+          <w:p>
+            <w:pPr>
+              <w:spacing w:before="0" w:after="0"/>
+            </w:pPr>
+            <w:r>
+              <w:rPr>
+                <w:sz w:val="18"/>
+              </w:rPr>
+              <w:t>Rules-Based Error</w:t>
+            </w:r>
+          </w:p>
+        </w:tc>
+        <w:tc>
+          <w:tcPr>
+            <w:tcW w:type="dxa" w:w="3168"/>
+            <w:tcMar>
+              <w:top w:w="60" w:type="dxa"/>
+              <w:bottom w:w="60" w:type="dxa"/>
+              <w:left w:w="80" w:type="dxa"/>
+              <w:right w:w="80" w:type="dxa"/>
+            </w:tcMar>
+          </w:tcPr>
+          <w:p>
+            <w:pPr>
+              <w:spacing w:before="0" w:after="0"/>
+            </w:pPr>
+            <w:r>
+              <w:rPr>
+                <w:sz w:val="18"/>
+              </w:rPr>
+              <w:t>Action violates established protocols, scope of practice, or medical director rules</w:t>
+            </w:r>
+          </w:p>
+        </w:tc>
+        <w:tc>
+          <w:tcPr>
+            <w:tcW w:type="dxa" w:w="4320"/>
+            <w:tcMar>
+              <w:top w:w="60" w:type="dxa"/>
+              <w:bottom w:w="60" w:type="dxa"/>
+              <w:left w:w="80" w:type="dxa"/>
+              <w:right w:w="80" w:type="dxa"/>
+            </w:tcMar>
+          </w:tcPr>
+          <w:p>
+            <w:pPr>
+              <w:spacing w:before="0" w:after="0"/>
+            </w:pPr>
+            <w:r>
+              <w:rPr>
+                <w:sz w:val="18"/>
+              </w:rPr>
+              <w:t>Administering a medication not authorized by your agency's standing orders or scope.</w:t>
+            </w:r>
+          </w:p>
+        </w:tc>
+      </w:tr>
+      <w:tr>
+        <w:tc>
+          <w:tcPr>
+            <w:tcW w:type="dxa" w:w="2592"/>
+            <w:shd w:fill="FBF2F2"/>
+            <w:tcMar>
+              <w:top w:w="60" w:type="dxa"/>
+              <w:bottom w:w="60" w:type="dxa"/>
+              <w:left w:w="80" w:type="dxa"/>
+              <w:right w:w="80" w:type="dxa"/>
+            </w:tcMar>
+          </w:tcPr>
+          <w:p>
+            <w:pPr>
+              <w:spacing w:before="0" w:after="0"/>
+            </w:pPr>
+            <w:r>
+              <w:rPr>
+                <w:sz w:val="18"/>
+              </w:rPr>
+              <w:t>Knowledge-Based Error</w:t>
+            </w:r>
+          </w:p>
+        </w:tc>
+        <w:tc>
+          <w:tcPr>
+            <w:tcW w:type="dxa" w:w="3168"/>
+            <w:shd w:fill="FBF2F2"/>
+            <w:tcMar>
+              <w:top w:w="60" w:type="dxa"/>
+              <w:bottom w:w="60" w:type="dxa"/>
+              <w:left w:w="80" w:type="dxa"/>
+              <w:right w:w="80" w:type="dxa"/>
+            </w:tcMar>
+          </w:tcPr>
+          <w:p>
+            <w:pPr>
+              <w:spacing w:before="0" w:after="0"/>
+            </w:pPr>
+            <w:r>
+              <w:rPr>
+                <w:sz w:val="18"/>
+              </w:rPr>
+              <w:t>Choosing the incorrect intervention due to flawed understanding of medicine</w:t>
+            </w:r>
+          </w:p>
+        </w:tc>
+        <w:tc>
+          <w:tcPr>
+            <w:tcW w:type="dxa" w:w="4320"/>
+            <w:shd w:fill="FBF2F2"/>
+            <w:tcMar>
+              <w:top w:w="60" w:type="dxa"/>
+              <w:bottom w:w="60" w:type="dxa"/>
+              <w:left w:w="80" w:type="dxa"/>
+              <w:right w:w="80" w:type="dxa"/>
+            </w:tcMar>
+          </w:tcPr>
+          <w:p>
+            <w:pPr>
+              <w:spacing w:before="0" w:after="0"/>
+            </w:pPr>
+            <w:r>
+              <w:rPr>
+                <w:sz w:val="18"/>
+              </w:rPr>
+              <w:t>Administering nitroglycerin to a patient with a confirmed right ventricular infarction or SBP &lt; 100.</w:t>
+            </w:r>
+          </w:p>
+        </w:tc>
+      </w:tr>
+      <w:tr>
+        <w:tc>
+          <w:tcPr>
+            <w:tcW w:type="dxa" w:w="2592"/>
+            <w:tcMar>
+              <w:top w:w="60" w:type="dxa"/>
+              <w:bottom w:w="60" w:type="dxa"/>
+              <w:left w:w="80" w:type="dxa"/>
+              <w:right w:w="80" w:type="dxa"/>
+            </w:tcMar>
+          </w:tcPr>
+          <w:p>
+            <w:pPr>
+              <w:spacing w:before="0" w:after="0"/>
+            </w:pPr>
+            <w:r>
+              <w:rPr>
+                <w:sz w:val="18"/>
+              </w:rPr>
+              <w:t>Skills-Based Error</w:t>
+            </w:r>
+          </w:p>
+        </w:tc>
+        <w:tc>
+          <w:tcPr>
+            <w:tcW w:type="dxa" w:w="3168"/>
+            <w:tcMar>
+              <w:top w:w="60" w:type="dxa"/>
+              <w:bottom w:w="60" w:type="dxa"/>
+              <w:left w:w="80" w:type="dxa"/>
+              <w:right w:w="80" w:type="dxa"/>
+            </w:tcMar>
+          </w:tcPr>
+          <w:p>
+            <w:pPr>
+              <w:spacing w:before="0" w:after="0"/>
+            </w:pPr>
+            <w:r>
+              <w:rPr>
+                <w:sz w:val="18"/>
+              </w:rPr>
+              <w:t>Mechanical or procedural slip during physical execution of a skill</w:t>
+            </w:r>
+          </w:p>
+        </w:tc>
+        <w:tc>
+          <w:tcPr>
+            <w:tcW w:type="dxa" w:w="4320"/>
+            <w:tcMar>
+              <w:top w:w="60" w:type="dxa"/>
+              <w:bottom w:w="60" w:type="dxa"/>
+              <w:left w:w="80" w:type="dxa"/>
+              <w:right w:w="80" w:type="dxa"/>
+            </w:tcMar>
+          </w:tcPr>
+          <w:p>
+            <w:pPr>
+              <w:spacing w:before="0" w:after="0"/>
+            </w:pPr>
+            <w:r>
+              <w:rPr>
+                <w:sz w:val="18"/>
+              </w:rPr>
+              <w:t>Failing to clear air from an IV administration line before connecting it to the catheter.</w:t>
+            </w:r>
+          </w:p>
+        </w:tc>
+      </w:tr>
+    </w:tbl>
     <w:sectPr>
       <w:pgSz w:w="12240" w:h="15840"/>
       <w:pgMar w:top="1080" w:right="1080" w:bottom="1080" w:left="1080" w:header="720" w:footer="720" w:gutter="0"/>

</xml_diff>